<commit_message>
full project capstone final submission with traces
</commit_message>
<xml_diff>
--- a/traced-project/banana_technical_report.docx
+++ b/traced-project/banana_technical_report.docx
@@ -12416,7 +12416,2904 @@
           <w:sz w:val="32"/>
           <w:szCs w:val="32"/>
         </w:rPr>
-        <w:t xml:space="preserve">12. Appendix — API Response Schema</w:t>
+        <w:t xml:space="preserve">11. Benchmark Analysis — Baseline vs Optimized</w:t>
+      </w:r>
+    </w:p>
+    <w:p>
+      <w:pPr>
+        <w:spacing w:before="80" w:after="100"/>
+        <w:jc w:val="both"/>
+      </w:pPr>
+      <w:r>
+        <w:rPr>
+          <w:rFonts w:ascii="Arial" w:cs="Arial" w:eastAsia="Arial" w:hAnsi="Arial"/>
+          <w:i w:val="false"/>
+          <w:iCs w:val="false"/>
+          <w:color w:val="404040"/>
+          <w:sz w:val="22"/>
+          <w:szCs w:val="22"/>
+        </w:rPr>
+        <w:t xml:space="preserve">The system includes a benchmark tool (benchmark.py) designed to compare the BASELINE pipeline (plain LLM with no retrieval) against the OPTIMIZED pipeline (RAG + agentic multi-tool) across hallucination rate, faithfulness score, grounded response rate, and latency. During initial benchmark runs, all metrics showed identical 100% / 0% values across both modes, which masked any meaningful comparison. This section documents the root cause analysis, the identified bug, the applied fix, and the corrected results.</w:t>
+      </w:r>
+    </w:p>
+    <w:p>
+      <w:pPr>
+        <w:pStyle w:val="Heading2"/>
+        <w:spacing w:before="240" w:after="120"/>
+      </w:pPr>
+      <w:r>
+        <w:rPr>
+          <w:rFonts w:ascii="Arial" w:cs="Arial" w:eastAsia="Arial" w:hAnsi="Arial"/>
+          <w:b/>
+          <w:bCs/>
+          <w:color w:val="2E75B6"/>
+          <w:sz w:val="26"/>
+          <w:szCs w:val="26"/>
+        </w:rPr>
+        <w:t xml:space="preserve">11.1 Initial (Incorrect) Benchmark Output</w:t>
+      </w:r>
+    </w:p>
+    <w:p>
+      <w:pPr>
+        <w:spacing w:before="80" w:after="100"/>
+        <w:jc w:val="both"/>
+      </w:pPr>
+      <w:r>
+        <w:rPr>
+          <w:rFonts w:ascii="Arial" w:cs="Arial" w:eastAsia="Arial" w:hAnsi="Arial"/>
+          <w:i w:val="false"/>
+          <w:iCs w:val="false"/>
+          <w:color w:val="404040"/>
+          <w:sz w:val="22"/>
+          <w:szCs w:val="22"/>
+        </w:rPr>
+        <w:t xml:space="preserve">The benchmark was run against the live Kubernetes API using the --url flag:</w:t>
+      </w:r>
+    </w:p>
+    <w:p>
+      <w:pPr>
+        <w:shd w:fill="EEF3F8" w:val="clear"/>
+        <w:spacing w:before="40" w:after="40"/>
+        <w:ind w:left="360"/>
+      </w:pPr>
+      <w:r>
+        <w:rPr>
+          <w:rFonts w:ascii="Courier New" w:cs="Courier New" w:eastAsia="Courier New" w:hAnsi="Courier New"/>
+          <w:color w:val="1F3864"/>
+          <w:sz w:val="18"/>
+          <w:szCs w:val="18"/>
+        </w:rPr>
+        <w:t xml:space="preserve">python3 benchmark.py --url http://localhost:8080</w:t>
+      </w:r>
+    </w:p>
+    <w:p>
+      <w:pPr>
+        <w:spacing w:before="0" w:after="0"/>
+      </w:pPr>
+      <w:r>
+        <w:t xml:space="preserve"/>
+      </w:r>
+    </w:p>
+    <w:tbl>
+      <w:tblPr>
+        <w:tblW w:type="dxa" w:w="9360"/>
+        <w:tblBorders>
+          <w:top w:val="single" w:color="auto" w:sz="4"/>
+          <w:left w:val="single" w:color="auto" w:sz="4"/>
+          <w:bottom w:val="single" w:color="auto" w:sz="4"/>
+          <w:right w:val="single" w:color="auto" w:sz="4"/>
+          <w:insideH w:val="single" w:color="auto" w:sz="4"/>
+          <w:insideV w:val="single" w:color="auto" w:sz="4"/>
+        </w:tblBorders>
+      </w:tblPr>
+      <w:tblGrid>
+        <w:gridCol w:w="3600"/>
+        <w:gridCol w:w="1800"/>
+        <w:gridCol w:w="1800"/>
+        <w:gridCol w:w="2160"/>
+      </w:tblGrid>
+      <w:tr>
+        <w:trPr>
+          <w:tblHeader/>
+        </w:trPr>
+        <w:tc>
+          <w:tcPr>
+            <w:tcW w:type="dxa" w:w="3600"/>
+            <w:tcBorders>
+              <w:top w:val="single" w:color="BBBBBB" w:sz="1"/>
+              <w:left w:val="single" w:color="BBBBBB" w:sz="1"/>
+              <w:bottom w:val="single" w:color="BBBBBB" w:sz="1"/>
+              <w:right w:val="single" w:color="BBBBBB" w:sz="1"/>
+            </w:tcBorders>
+            <w:shd w:fill="1F3864" w:val="clear"/>
+            <w:tcMar>
+              <w:top w:type="dxa" w:w="80"/>
+              <w:left w:type="dxa" w:w="120"/>
+              <w:bottom w:type="dxa" w:w="80"/>
+              <w:right w:type="dxa" w:w="120"/>
+            </w:tcMar>
+          </w:tcPr>
+          <w:p>
+            <w:pPr>
+              <w:jc w:val="center"/>
+            </w:pPr>
+            <w:r>
+              <w:rPr>
+                <w:rFonts w:ascii="Arial" w:cs="Arial" w:eastAsia="Arial" w:hAnsi="Arial"/>
+                <w:b/>
+                <w:bCs/>
+                <w:color w:val="FFFFFF"/>
+                <w:sz w:val="20"/>
+                <w:szCs w:val="20"/>
+              </w:rPr>
+              <w:t xml:space="preserve">Metric</w:t>
+            </w:r>
+          </w:p>
+        </w:tc>
+        <w:tc>
+          <w:tcPr>
+            <w:tcW w:type="dxa" w:w="1800"/>
+            <w:tcBorders>
+              <w:top w:val="single" w:color="BBBBBB" w:sz="1"/>
+              <w:left w:val="single" w:color="BBBBBB" w:sz="1"/>
+              <w:bottom w:val="single" w:color="BBBBBB" w:sz="1"/>
+              <w:right w:val="single" w:color="BBBBBB" w:sz="1"/>
+            </w:tcBorders>
+            <w:shd w:fill="1F3864" w:val="clear"/>
+            <w:tcMar>
+              <w:top w:type="dxa" w:w="80"/>
+              <w:left w:type="dxa" w:w="120"/>
+              <w:bottom w:type="dxa" w:w="80"/>
+              <w:right w:type="dxa" w:w="120"/>
+            </w:tcMar>
+          </w:tcPr>
+          <w:p>
+            <w:pPr>
+              <w:jc w:val="center"/>
+            </w:pPr>
+            <w:r>
+              <w:rPr>
+                <w:rFonts w:ascii="Arial" w:cs="Arial" w:eastAsia="Arial" w:hAnsi="Arial"/>
+                <w:b/>
+                <w:bCs/>
+                <w:color w:val="FFFFFF"/>
+                <w:sz w:val="20"/>
+                <w:szCs w:val="20"/>
+              </w:rPr>
+              <w:t xml:space="preserve">BASELINE</w:t>
+            </w:r>
+          </w:p>
+        </w:tc>
+        <w:tc>
+          <w:tcPr>
+            <w:tcW w:type="dxa" w:w="1800"/>
+            <w:tcBorders>
+              <w:top w:val="single" w:color="BBBBBB" w:sz="1"/>
+              <w:left w:val="single" w:color="BBBBBB" w:sz="1"/>
+              <w:bottom w:val="single" w:color="BBBBBB" w:sz="1"/>
+              <w:right w:val="single" w:color="BBBBBB" w:sz="1"/>
+            </w:tcBorders>
+            <w:shd w:fill="1F3864" w:val="clear"/>
+            <w:tcMar>
+              <w:top w:type="dxa" w:w="80"/>
+              <w:left w:type="dxa" w:w="120"/>
+              <w:bottom w:type="dxa" w:w="80"/>
+              <w:right w:type="dxa" w:w="120"/>
+            </w:tcMar>
+          </w:tcPr>
+          <w:p>
+            <w:pPr>
+              <w:jc w:val="center"/>
+            </w:pPr>
+            <w:r>
+              <w:rPr>
+                <w:rFonts w:ascii="Arial" w:cs="Arial" w:eastAsia="Arial" w:hAnsi="Arial"/>
+                <w:b/>
+                <w:bCs/>
+                <w:color w:val="FFFFFF"/>
+                <w:sz w:val="20"/>
+                <w:szCs w:val="20"/>
+              </w:rPr>
+              <w:t xml:space="preserve">OPTIMIZED</w:t>
+            </w:r>
+          </w:p>
+        </w:tc>
+        <w:tc>
+          <w:tcPr>
+            <w:tcW w:type="dxa" w:w="2160"/>
+            <w:tcBorders>
+              <w:top w:val="single" w:color="BBBBBB" w:sz="1"/>
+              <w:left w:val="single" w:color="BBBBBB" w:sz="1"/>
+              <w:bottom w:val="single" w:color="BBBBBB" w:sz="1"/>
+              <w:right w:val="single" w:color="BBBBBB" w:sz="1"/>
+            </w:tcBorders>
+            <w:shd w:fill="1F3864" w:val="clear"/>
+            <w:tcMar>
+              <w:top w:type="dxa" w:w="80"/>
+              <w:left w:type="dxa" w:w="120"/>
+              <w:bottom w:type="dxa" w:w="80"/>
+              <w:right w:type="dxa" w:w="120"/>
+            </w:tcMar>
+          </w:tcPr>
+          <w:p>
+            <w:pPr>
+              <w:jc w:val="center"/>
+            </w:pPr>
+            <w:r>
+              <w:rPr>
+                <w:rFonts w:ascii="Arial" w:cs="Arial" w:eastAsia="Arial" w:hAnsi="Arial"/>
+                <w:b/>
+                <w:bCs/>
+                <w:color w:val="FFFFFF"/>
+                <w:sz w:val="20"/>
+                <w:szCs w:val="20"/>
+              </w:rPr>
+              <w:t xml:space="preserve">Winner</w:t>
+            </w:r>
+          </w:p>
+        </w:tc>
+      </w:tr>
+      <w:tr>
+        <w:tc>
+          <w:tcPr>
+            <w:tcW w:type="dxa" w:w="3600"/>
+            <w:tcBorders>
+              <w:top w:val="single" w:color="BBBBBB" w:sz="1"/>
+              <w:left w:val="single" w:color="BBBBBB" w:sz="1"/>
+              <w:bottom w:val="single" w:color="BBBBBB" w:sz="1"/>
+              <w:right w:val="single" w:color="BBBBBB" w:sz="1"/>
+            </w:tcBorders>
+            <w:shd w:fill="FFFFFF" w:val="clear"/>
+            <w:tcMar>
+              <w:top w:type="dxa" w:w="80"/>
+              <w:left w:type="dxa" w:w="120"/>
+              <w:bottom w:type="dxa" w:w="80"/>
+              <w:right w:type="dxa" w:w="120"/>
+            </w:tcMar>
+          </w:tcPr>
+          <w:p>
+            <w:pPr>
+              <w:jc w:val="left"/>
+            </w:pPr>
+            <w:r>
+              <w:rPr>
+                <w:rFonts w:ascii="Arial" w:cs="Arial" w:eastAsia="Arial" w:hAnsi="Arial"/>
+                <w:color w:val="404040"/>
+                <w:sz w:val="20"/>
+                <w:szCs w:val="20"/>
+              </w:rPr>
+              <w:t xml:space="preserve">Hallucination Rate (avg)</w:t>
+            </w:r>
+          </w:p>
+        </w:tc>
+        <w:tc>
+          <w:tcPr>
+            <w:tcW w:type="dxa" w:w="1800"/>
+            <w:tcBorders>
+              <w:top w:val="single" w:color="BBBBBB" w:sz="1"/>
+              <w:left w:val="single" w:color="BBBBBB" w:sz="1"/>
+              <w:bottom w:val="single" w:color="BBBBBB" w:sz="1"/>
+              <w:right w:val="single" w:color="BBBBBB" w:sz="1"/>
+            </w:tcBorders>
+            <w:shd w:fill="FFFFFF" w:val="clear"/>
+            <w:tcMar>
+              <w:top w:type="dxa" w:w="80"/>
+              <w:left w:type="dxa" w:w="120"/>
+              <w:bottom w:type="dxa" w:w="80"/>
+              <w:right w:type="dxa" w:w="120"/>
+            </w:tcMar>
+          </w:tcPr>
+          <w:p>
+            <w:pPr>
+              <w:jc w:val="left"/>
+            </w:pPr>
+            <w:r>
+              <w:rPr>
+                <w:rFonts w:ascii="Arial" w:cs="Arial" w:eastAsia="Arial" w:hAnsi="Arial"/>
+                <w:color w:val="404040"/>
+                <w:sz w:val="20"/>
+                <w:szCs w:val="20"/>
+              </w:rPr>
+              <w:t xml:space="preserve">100.0%</w:t>
+            </w:r>
+          </w:p>
+        </w:tc>
+        <w:tc>
+          <w:tcPr>
+            <w:tcW w:type="dxa" w:w="1800"/>
+            <w:tcBorders>
+              <w:top w:val="single" w:color="BBBBBB" w:sz="1"/>
+              <w:left w:val="single" w:color="BBBBBB" w:sz="1"/>
+              <w:bottom w:val="single" w:color="BBBBBB" w:sz="1"/>
+              <w:right w:val="single" w:color="BBBBBB" w:sz="1"/>
+            </w:tcBorders>
+            <w:shd w:fill="FFFFFF" w:val="clear"/>
+            <w:tcMar>
+              <w:top w:type="dxa" w:w="80"/>
+              <w:left w:type="dxa" w:w="120"/>
+              <w:bottom w:type="dxa" w:w="80"/>
+              <w:right w:type="dxa" w:w="120"/>
+            </w:tcMar>
+          </w:tcPr>
+          <w:p>
+            <w:pPr>
+              <w:jc w:val="left"/>
+            </w:pPr>
+            <w:r>
+              <w:rPr>
+                <w:rFonts w:ascii="Arial" w:cs="Arial" w:eastAsia="Arial" w:hAnsi="Arial"/>
+                <w:color w:val="404040"/>
+                <w:sz w:val="20"/>
+                <w:szCs w:val="20"/>
+              </w:rPr>
+              <w:t xml:space="preserve">100.0%</w:t>
+            </w:r>
+          </w:p>
+        </w:tc>
+        <w:tc>
+          <w:tcPr>
+            <w:tcW w:type="dxa" w:w="2160"/>
+            <w:tcBorders>
+              <w:top w:val="single" w:color="BBBBBB" w:sz="1"/>
+              <w:left w:val="single" w:color="BBBBBB" w:sz="1"/>
+              <w:bottom w:val="single" w:color="BBBBBB" w:sz="1"/>
+              <w:right w:val="single" w:color="BBBBBB" w:sz="1"/>
+            </w:tcBorders>
+            <w:shd w:fill="FFFFFF" w:val="clear"/>
+            <w:tcMar>
+              <w:top w:type="dxa" w:w="80"/>
+              <w:left w:type="dxa" w:w="120"/>
+              <w:bottom w:type="dxa" w:w="80"/>
+              <w:right w:type="dxa" w:w="120"/>
+            </w:tcMar>
+          </w:tcPr>
+          <w:p>
+            <w:pPr>
+              <w:jc w:val="left"/>
+            </w:pPr>
+            <w:r>
+              <w:rPr>
+                <w:rFonts w:ascii="Arial" w:cs="Arial" w:eastAsia="Arial" w:hAnsi="Arial"/>
+                <w:color w:val="404040"/>
+                <w:sz w:val="20"/>
+                <w:szCs w:val="20"/>
+              </w:rPr>
+              <w:t xml:space="preserve">TIE</w:t>
+            </w:r>
+          </w:p>
+        </w:tc>
+      </w:tr>
+      <w:tr>
+        <w:tc>
+          <w:tcPr>
+            <w:tcW w:type="dxa" w:w="3600"/>
+            <w:tcBorders>
+              <w:top w:val="single" w:color="BBBBBB" w:sz="1"/>
+              <w:left w:val="single" w:color="BBBBBB" w:sz="1"/>
+              <w:bottom w:val="single" w:color="BBBBBB" w:sz="1"/>
+              <w:right w:val="single" w:color="BBBBBB" w:sz="1"/>
+            </w:tcBorders>
+            <w:shd w:fill="F2F2F2" w:val="clear"/>
+            <w:tcMar>
+              <w:top w:type="dxa" w:w="80"/>
+              <w:left w:type="dxa" w:w="120"/>
+              <w:bottom w:type="dxa" w:w="80"/>
+              <w:right w:type="dxa" w:w="120"/>
+            </w:tcMar>
+          </w:tcPr>
+          <w:p>
+            <w:pPr>
+              <w:jc w:val="left"/>
+            </w:pPr>
+            <w:r>
+              <w:rPr>
+                <w:rFonts w:ascii="Arial" w:cs="Arial" w:eastAsia="Arial" w:hAnsi="Arial"/>
+                <w:color w:val="404040"/>
+                <w:sz w:val="20"/>
+                <w:szCs w:val="20"/>
+              </w:rPr>
+              <w:t xml:space="preserve">Faithfulness Score (avg)</w:t>
+            </w:r>
+          </w:p>
+        </w:tc>
+        <w:tc>
+          <w:tcPr>
+            <w:tcW w:type="dxa" w:w="1800"/>
+            <w:tcBorders>
+              <w:top w:val="single" w:color="BBBBBB" w:sz="1"/>
+              <w:left w:val="single" w:color="BBBBBB" w:sz="1"/>
+              <w:bottom w:val="single" w:color="BBBBBB" w:sz="1"/>
+              <w:right w:val="single" w:color="BBBBBB" w:sz="1"/>
+            </w:tcBorders>
+            <w:shd w:fill="F2F2F2" w:val="clear"/>
+            <w:tcMar>
+              <w:top w:type="dxa" w:w="80"/>
+              <w:left w:type="dxa" w:w="120"/>
+              <w:bottom w:type="dxa" w:w="80"/>
+              <w:right w:type="dxa" w:w="120"/>
+            </w:tcMar>
+          </w:tcPr>
+          <w:p>
+            <w:pPr>
+              <w:jc w:val="left"/>
+            </w:pPr>
+            <w:r>
+              <w:rPr>
+                <w:rFonts w:ascii="Arial" w:cs="Arial" w:eastAsia="Arial" w:hAnsi="Arial"/>
+                <w:color w:val="404040"/>
+                <w:sz w:val="20"/>
+                <w:szCs w:val="20"/>
+              </w:rPr>
+              <w:t xml:space="preserve">  0.0%</w:t>
+            </w:r>
+          </w:p>
+        </w:tc>
+        <w:tc>
+          <w:tcPr>
+            <w:tcW w:type="dxa" w:w="1800"/>
+            <w:tcBorders>
+              <w:top w:val="single" w:color="BBBBBB" w:sz="1"/>
+              <w:left w:val="single" w:color="BBBBBB" w:sz="1"/>
+              <w:bottom w:val="single" w:color="BBBBBB" w:sz="1"/>
+              <w:right w:val="single" w:color="BBBBBB" w:sz="1"/>
+            </w:tcBorders>
+            <w:shd w:fill="F2F2F2" w:val="clear"/>
+            <w:tcMar>
+              <w:top w:type="dxa" w:w="80"/>
+              <w:left w:type="dxa" w:w="120"/>
+              <w:bottom w:type="dxa" w:w="80"/>
+              <w:right w:type="dxa" w:w="120"/>
+            </w:tcMar>
+          </w:tcPr>
+          <w:p>
+            <w:pPr>
+              <w:jc w:val="left"/>
+            </w:pPr>
+            <w:r>
+              <w:rPr>
+                <w:rFonts w:ascii="Arial" w:cs="Arial" w:eastAsia="Arial" w:hAnsi="Arial"/>
+                <w:color w:val="404040"/>
+                <w:sz w:val="20"/>
+                <w:szCs w:val="20"/>
+              </w:rPr>
+              <w:t xml:space="preserve">0.0%</w:t>
+            </w:r>
+          </w:p>
+        </w:tc>
+        <w:tc>
+          <w:tcPr>
+            <w:tcW w:type="dxa" w:w="2160"/>
+            <w:tcBorders>
+              <w:top w:val="single" w:color="BBBBBB" w:sz="1"/>
+              <w:left w:val="single" w:color="BBBBBB" w:sz="1"/>
+              <w:bottom w:val="single" w:color="BBBBBB" w:sz="1"/>
+              <w:right w:val="single" w:color="BBBBBB" w:sz="1"/>
+            </w:tcBorders>
+            <w:shd w:fill="F2F2F2" w:val="clear"/>
+            <w:tcMar>
+              <w:top w:type="dxa" w:w="80"/>
+              <w:left w:type="dxa" w:w="120"/>
+              <w:bottom w:type="dxa" w:w="80"/>
+              <w:right w:type="dxa" w:w="120"/>
+            </w:tcMar>
+          </w:tcPr>
+          <w:p>
+            <w:pPr>
+              <w:jc w:val="left"/>
+            </w:pPr>
+            <w:r>
+              <w:rPr>
+                <w:rFonts w:ascii="Arial" w:cs="Arial" w:eastAsia="Arial" w:hAnsi="Arial"/>
+                <w:color w:val="404040"/>
+                <w:sz w:val="20"/>
+                <w:szCs w:val="20"/>
+              </w:rPr>
+              <w:t xml:space="preserve">TIE</w:t>
+            </w:r>
+          </w:p>
+        </w:tc>
+      </w:tr>
+      <w:tr>
+        <w:tc>
+          <w:tcPr>
+            <w:tcW w:type="dxa" w:w="3600"/>
+            <w:tcBorders>
+              <w:top w:val="single" w:color="BBBBBB" w:sz="1"/>
+              <w:left w:val="single" w:color="BBBBBB" w:sz="1"/>
+              <w:bottom w:val="single" w:color="BBBBBB" w:sz="1"/>
+              <w:right w:val="single" w:color="BBBBBB" w:sz="1"/>
+            </w:tcBorders>
+            <w:shd w:fill="FFFFFF" w:val="clear"/>
+            <w:tcMar>
+              <w:top w:type="dxa" w:w="80"/>
+              <w:left w:type="dxa" w:w="120"/>
+              <w:bottom w:type="dxa" w:w="80"/>
+              <w:right w:type="dxa" w:w="120"/>
+            </w:tcMar>
+          </w:tcPr>
+          <w:p>
+            <w:pPr>
+              <w:jc w:val="left"/>
+            </w:pPr>
+            <w:r>
+              <w:rPr>
+                <w:rFonts w:ascii="Arial" w:cs="Arial" w:eastAsia="Arial" w:hAnsi="Arial"/>
+                <w:color w:val="404040"/>
+                <w:sz w:val="20"/>
+                <w:szCs w:val="20"/>
+              </w:rPr>
+              <w:t xml:space="preserve">Grounded Responses</w:t>
+            </w:r>
+          </w:p>
+        </w:tc>
+        <w:tc>
+          <w:tcPr>
+            <w:tcW w:type="dxa" w:w="1800"/>
+            <w:tcBorders>
+              <w:top w:val="single" w:color="BBBBBB" w:sz="1"/>
+              <w:left w:val="single" w:color="BBBBBB" w:sz="1"/>
+              <w:bottom w:val="single" w:color="BBBBBB" w:sz="1"/>
+              <w:right w:val="single" w:color="BBBBBB" w:sz="1"/>
+            </w:tcBorders>
+            <w:shd w:fill="FFFFFF" w:val="clear"/>
+            <w:tcMar>
+              <w:top w:type="dxa" w:w="80"/>
+              <w:left w:type="dxa" w:w="120"/>
+              <w:bottom w:type="dxa" w:w="80"/>
+              <w:right w:type="dxa" w:w="120"/>
+            </w:tcMar>
+          </w:tcPr>
+          <w:p>
+            <w:pPr>
+              <w:jc w:val="left"/>
+            </w:pPr>
+            <w:r>
+              <w:rPr>
+                <w:rFonts w:ascii="Arial" w:cs="Arial" w:eastAsia="Arial" w:hAnsi="Arial"/>
+                <w:color w:val="404040"/>
+                <w:sz w:val="20"/>
+                <w:szCs w:val="20"/>
+              </w:rPr>
+              <w:t xml:space="preserve">100.0%</w:t>
+            </w:r>
+          </w:p>
+        </w:tc>
+        <w:tc>
+          <w:tcPr>
+            <w:tcW w:type="dxa" w:w="1800"/>
+            <w:tcBorders>
+              <w:top w:val="single" w:color="BBBBBB" w:sz="1"/>
+              <w:left w:val="single" w:color="BBBBBB" w:sz="1"/>
+              <w:bottom w:val="single" w:color="BBBBBB" w:sz="1"/>
+              <w:right w:val="single" w:color="BBBBBB" w:sz="1"/>
+            </w:tcBorders>
+            <w:shd w:fill="FFFFFF" w:val="clear"/>
+            <w:tcMar>
+              <w:top w:type="dxa" w:w="80"/>
+              <w:left w:type="dxa" w:w="120"/>
+              <w:bottom w:type="dxa" w:w="80"/>
+              <w:right w:type="dxa" w:w="120"/>
+            </w:tcMar>
+          </w:tcPr>
+          <w:p>
+            <w:pPr>
+              <w:jc w:val="left"/>
+            </w:pPr>
+            <w:r>
+              <w:rPr>
+                <w:rFonts w:ascii="Arial" w:cs="Arial" w:eastAsia="Arial" w:hAnsi="Arial"/>
+                <w:color w:val="404040"/>
+                <w:sz w:val="20"/>
+                <w:szCs w:val="20"/>
+              </w:rPr>
+              <w:t xml:space="preserve">100.0%</w:t>
+            </w:r>
+          </w:p>
+        </w:tc>
+        <w:tc>
+          <w:tcPr>
+            <w:tcW w:type="dxa" w:w="2160"/>
+            <w:tcBorders>
+              <w:top w:val="single" w:color="BBBBBB" w:sz="1"/>
+              <w:left w:val="single" w:color="BBBBBB" w:sz="1"/>
+              <w:bottom w:val="single" w:color="BBBBBB" w:sz="1"/>
+              <w:right w:val="single" w:color="BBBBBB" w:sz="1"/>
+            </w:tcBorders>
+            <w:shd w:fill="FFFFFF" w:val="clear"/>
+            <w:tcMar>
+              <w:top w:type="dxa" w:w="80"/>
+              <w:left w:type="dxa" w:w="120"/>
+              <w:bottom w:type="dxa" w:w="80"/>
+              <w:right w:type="dxa" w:w="120"/>
+            </w:tcMar>
+          </w:tcPr>
+          <w:p>
+            <w:pPr>
+              <w:jc w:val="left"/>
+            </w:pPr>
+            <w:r>
+              <w:rPr>
+                <w:rFonts w:ascii="Arial" w:cs="Arial" w:eastAsia="Arial" w:hAnsi="Arial"/>
+                <w:color w:val="404040"/>
+                <w:sz w:val="20"/>
+                <w:szCs w:val="20"/>
+              </w:rPr>
+              <w:t xml:space="preserve">TIE</w:t>
+            </w:r>
+          </w:p>
+        </w:tc>
+      </w:tr>
+      <w:tr>
+        <w:tc>
+          <w:tcPr>
+            <w:tcW w:type="dxa" w:w="3600"/>
+            <w:tcBorders>
+              <w:top w:val="single" w:color="BBBBBB" w:sz="1"/>
+              <w:left w:val="single" w:color="BBBBBB" w:sz="1"/>
+              <w:bottom w:val="single" w:color="BBBBBB" w:sz="1"/>
+              <w:right w:val="single" w:color="BBBBBB" w:sz="1"/>
+            </w:tcBorders>
+            <w:shd w:fill="F2F2F2" w:val="clear"/>
+            <w:tcMar>
+              <w:top w:type="dxa" w:w="80"/>
+              <w:left w:type="dxa" w:w="120"/>
+              <w:bottom w:type="dxa" w:w="80"/>
+              <w:right w:type="dxa" w:w="120"/>
+            </w:tcMar>
+          </w:tcPr>
+          <w:p>
+            <w:pPr>
+              <w:jc w:val="left"/>
+            </w:pPr>
+            <w:r>
+              <w:rPr>
+                <w:rFonts w:ascii="Arial" w:cs="Arial" w:eastAsia="Arial" w:hAnsi="Arial"/>
+                <w:color w:val="404040"/>
+                <w:sz w:val="20"/>
+                <w:szCs w:val="20"/>
+              </w:rPr>
+              <w:t xml:space="preserve">Blocked (hallucin. guard)</w:t>
+            </w:r>
+          </w:p>
+        </w:tc>
+        <w:tc>
+          <w:tcPr>
+            <w:tcW w:type="dxa" w:w="1800"/>
+            <w:tcBorders>
+              <w:top w:val="single" w:color="BBBBBB" w:sz="1"/>
+              <w:left w:val="single" w:color="BBBBBB" w:sz="1"/>
+              <w:bottom w:val="single" w:color="BBBBBB" w:sz="1"/>
+              <w:right w:val="single" w:color="BBBBBB" w:sz="1"/>
+            </w:tcBorders>
+            <w:shd w:fill="F2F2F2" w:val="clear"/>
+            <w:tcMar>
+              <w:top w:type="dxa" w:w="80"/>
+              <w:left w:type="dxa" w:w="120"/>
+              <w:bottom w:type="dxa" w:w="80"/>
+              <w:right w:type="dxa" w:w="120"/>
+            </w:tcMar>
+          </w:tcPr>
+          <w:p>
+            <w:pPr>
+              <w:jc w:val="left"/>
+            </w:pPr>
+            <w:r>
+              <w:rPr>
+                <w:rFonts w:ascii="Arial" w:cs="Arial" w:eastAsia="Arial" w:hAnsi="Arial"/>
+                <w:color w:val="404040"/>
+                <w:sz w:val="20"/>
+                <w:szCs w:val="20"/>
+              </w:rPr>
+              <w:t xml:space="preserve">  0.0%</w:t>
+            </w:r>
+          </w:p>
+        </w:tc>
+        <w:tc>
+          <w:tcPr>
+            <w:tcW w:type="dxa" w:w="1800"/>
+            <w:tcBorders>
+              <w:top w:val="single" w:color="BBBBBB" w:sz="1"/>
+              <w:left w:val="single" w:color="BBBBBB" w:sz="1"/>
+              <w:bottom w:val="single" w:color="BBBBBB" w:sz="1"/>
+              <w:right w:val="single" w:color="BBBBBB" w:sz="1"/>
+            </w:tcBorders>
+            <w:shd w:fill="F2F2F2" w:val="clear"/>
+            <w:tcMar>
+              <w:top w:type="dxa" w:w="80"/>
+              <w:left w:type="dxa" w:w="120"/>
+              <w:bottom w:type="dxa" w:w="80"/>
+              <w:right w:type="dxa" w:w="120"/>
+            </w:tcMar>
+          </w:tcPr>
+          <w:p>
+            <w:pPr>
+              <w:jc w:val="left"/>
+            </w:pPr>
+            <w:r>
+              <w:rPr>
+                <w:rFonts w:ascii="Arial" w:cs="Arial" w:eastAsia="Arial" w:hAnsi="Arial"/>
+                <w:color w:val="404040"/>
+                <w:sz w:val="20"/>
+                <w:szCs w:val="20"/>
+              </w:rPr>
+              <w:t xml:space="preserve">0.0%</w:t>
+            </w:r>
+          </w:p>
+        </w:tc>
+        <w:tc>
+          <w:tcPr>
+            <w:tcW w:type="dxa" w:w="2160"/>
+            <w:tcBorders>
+              <w:top w:val="single" w:color="BBBBBB" w:sz="1"/>
+              <w:left w:val="single" w:color="BBBBBB" w:sz="1"/>
+              <w:bottom w:val="single" w:color="BBBBBB" w:sz="1"/>
+              <w:right w:val="single" w:color="BBBBBB" w:sz="1"/>
+            </w:tcBorders>
+            <w:shd w:fill="F2F2F2" w:val="clear"/>
+            <w:tcMar>
+              <w:top w:type="dxa" w:w="80"/>
+              <w:left w:type="dxa" w:w="120"/>
+              <w:bottom w:type="dxa" w:w="80"/>
+              <w:right w:type="dxa" w:w="120"/>
+            </w:tcMar>
+          </w:tcPr>
+          <w:p>
+            <w:pPr>
+              <w:jc w:val="left"/>
+            </w:pPr>
+            <w:r>
+              <w:rPr>
+                <w:rFonts w:ascii="Arial" w:cs="Arial" w:eastAsia="Arial" w:hAnsi="Arial"/>
+                <w:color w:val="404040"/>
+                <w:sz w:val="20"/>
+                <w:szCs w:val="20"/>
+              </w:rPr>
+              <w:t xml:space="preserve">TIE</w:t>
+            </w:r>
+          </w:p>
+        </w:tc>
+      </w:tr>
+      <w:tr>
+        <w:tc>
+          <w:tcPr>
+            <w:tcW w:type="dxa" w:w="3600"/>
+            <w:tcBorders>
+              <w:top w:val="single" w:color="BBBBBB" w:sz="1"/>
+              <w:left w:val="single" w:color="BBBBBB" w:sz="1"/>
+              <w:bottom w:val="single" w:color="BBBBBB" w:sz="1"/>
+              <w:right w:val="single" w:color="BBBBBB" w:sz="1"/>
+            </w:tcBorders>
+            <w:shd w:fill="FFFFFF" w:val="clear"/>
+            <w:tcMar>
+              <w:top w:type="dxa" w:w="80"/>
+              <w:left w:type="dxa" w:w="120"/>
+              <w:bottom w:type="dxa" w:w="80"/>
+              <w:right w:type="dxa" w:w="120"/>
+            </w:tcMar>
+          </w:tcPr>
+          <w:p>
+            <w:pPr>
+              <w:jc w:val="left"/>
+            </w:pPr>
+            <w:r>
+              <w:rPr>
+                <w:rFonts w:ascii="Arial" w:cs="Arial" w:eastAsia="Arial" w:hAnsi="Arial"/>
+                <w:color w:val="404040"/>
+                <w:sz w:val="20"/>
+                <w:szCs w:val="20"/>
+              </w:rPr>
+              <w:t xml:space="preserve">Avg Latency (s)</w:t>
+            </w:r>
+          </w:p>
+        </w:tc>
+        <w:tc>
+          <w:tcPr>
+            <w:tcW w:type="dxa" w:w="1800"/>
+            <w:tcBorders>
+              <w:top w:val="single" w:color="BBBBBB" w:sz="1"/>
+              <w:left w:val="single" w:color="BBBBBB" w:sz="1"/>
+              <w:bottom w:val="single" w:color="BBBBBB" w:sz="1"/>
+              <w:right w:val="single" w:color="BBBBBB" w:sz="1"/>
+            </w:tcBorders>
+            <w:shd w:fill="FFFFFF" w:val="clear"/>
+            <w:tcMar>
+              <w:top w:type="dxa" w:w="80"/>
+              <w:left w:type="dxa" w:w="120"/>
+              <w:bottom w:type="dxa" w:w="80"/>
+              <w:right w:type="dxa" w:w="120"/>
+            </w:tcMar>
+          </w:tcPr>
+          <w:p>
+            <w:pPr>
+              <w:jc w:val="left"/>
+            </w:pPr>
+            <w:r>
+              <w:rPr>
+                <w:rFonts w:ascii="Arial" w:cs="Arial" w:eastAsia="Arial" w:hAnsi="Arial"/>
+                <w:color w:val="404040"/>
+                <w:sz w:val="20"/>
+                <w:szCs w:val="20"/>
+              </w:rPr>
+              <w:t xml:space="preserve"> 11.37</w:t>
+            </w:r>
+          </w:p>
+        </w:tc>
+        <w:tc>
+          <w:tcPr>
+            <w:tcW w:type="dxa" w:w="1800"/>
+            <w:tcBorders>
+              <w:top w:val="single" w:color="BBBBBB" w:sz="1"/>
+              <w:left w:val="single" w:color="BBBBBB" w:sz="1"/>
+              <w:bottom w:val="single" w:color="BBBBBB" w:sz="1"/>
+              <w:right w:val="single" w:color="BBBBBB" w:sz="1"/>
+            </w:tcBorders>
+            <w:shd w:fill="FFFFFF" w:val="clear"/>
+            <w:tcMar>
+              <w:top w:type="dxa" w:w="80"/>
+              <w:left w:type="dxa" w:w="120"/>
+              <w:bottom w:type="dxa" w:w="80"/>
+              <w:right w:type="dxa" w:w="120"/>
+            </w:tcMar>
+          </w:tcPr>
+          <w:p>
+            <w:pPr>
+              <w:jc w:val="left"/>
+            </w:pPr>
+            <w:r>
+              <w:rPr>
+                <w:rFonts w:ascii="Arial" w:cs="Arial" w:eastAsia="Arial" w:hAnsi="Arial"/>
+                <w:color w:val="404040"/>
+                <w:sz w:val="20"/>
+                <w:szCs w:val="20"/>
+              </w:rPr>
+              <w:t xml:space="preserve"> 6.73</w:t>
+            </w:r>
+          </w:p>
+        </w:tc>
+        <w:tc>
+          <w:tcPr>
+            <w:tcW w:type="dxa" w:w="2160"/>
+            <w:tcBorders>
+              <w:top w:val="single" w:color="BBBBBB" w:sz="1"/>
+              <w:left w:val="single" w:color="BBBBBB" w:sz="1"/>
+              <w:bottom w:val="single" w:color="BBBBBB" w:sz="1"/>
+              <w:right w:val="single" w:color="BBBBBB" w:sz="1"/>
+            </w:tcBorders>
+            <w:shd w:fill="FFFFFF" w:val="clear"/>
+            <w:tcMar>
+              <w:top w:type="dxa" w:w="80"/>
+              <w:left w:type="dxa" w:w="120"/>
+              <w:bottom w:type="dxa" w:w="80"/>
+              <w:right w:type="dxa" w:w="120"/>
+            </w:tcMar>
+          </w:tcPr>
+          <w:p>
+            <w:pPr>
+              <w:jc w:val="left"/>
+            </w:pPr>
+            <w:r>
+              <w:rPr>
+                <w:rFonts w:ascii="Arial" w:cs="Arial" w:eastAsia="Arial" w:hAnsi="Arial"/>
+                <w:color w:val="404040"/>
+                <w:sz w:val="20"/>
+                <w:szCs w:val="20"/>
+              </w:rPr>
+              <w:t xml:space="preserve">OPTIMIZED</w:t>
+            </w:r>
+          </w:p>
+        </w:tc>
+      </w:tr>
+    </w:tbl>
+    <w:p>
+      <w:pPr>
+        <w:spacing w:before="0" w:after="0"/>
+      </w:pPr>
+      <w:r>
+        <w:t xml:space="preserve"/>
+      </w:r>
+    </w:p>
+    <w:p>
+      <w:pPr>
+        <w:spacing w:before="80" w:after="100"/>
+        <w:jc w:val="both"/>
+      </w:pPr>
+      <w:r>
+        <w:rPr>
+          <w:rFonts w:ascii="Arial" w:cs="Arial" w:eastAsia="Arial" w:hAnsi="Arial"/>
+          <w:i w:val="false"/>
+          <w:iCs w:val="false"/>
+          <w:color w:val="404040"/>
+          <w:sz w:val="22"/>
+          <w:szCs w:val="22"/>
+        </w:rPr>
+        <w:t xml:space="preserve">All metrics were identical except latency. This result is incorrect and indicates a measurement bug, not a real equivalence between the two pipelines.</w:t>
+      </w:r>
+    </w:p>
+    <w:p>
+      <w:pPr>
+        <w:pStyle w:val="Heading2"/>
+        <w:spacing w:before="240" w:after="120"/>
+      </w:pPr>
+      <w:r>
+        <w:rPr>
+          <w:rFonts w:ascii="Arial" w:cs="Arial" w:eastAsia="Arial" w:hAnsi="Arial"/>
+          <w:b/>
+          <w:bCs/>
+          <w:color w:val="2E75B6"/>
+          <w:sz w:val="26"/>
+          <w:szCs w:val="26"/>
+        </w:rPr>
+        <w:t xml:space="preserve">11.2 Root Cause Analysis</w:t>
+      </w:r>
+    </w:p>
+    <w:p>
+      <w:pPr>
+        <w:spacing w:before="80" w:after="100"/>
+        <w:jc w:val="both"/>
+      </w:pPr>
+      <w:r>
+        <w:rPr>
+          <w:rFonts w:ascii="Arial" w:cs="Arial" w:eastAsia="Arial" w:hAnsi="Arial"/>
+          <w:i w:val="false"/>
+          <w:iCs w:val="false"/>
+          <w:color w:val="404040"/>
+          <w:sz w:val="22"/>
+          <w:szCs w:val="22"/>
+        </w:rPr>
+        <w:t xml:space="preserve">Three independent causes combined to produce the misleading output.</w:t>
+      </w:r>
+    </w:p>
+    <w:p>
+      <w:pPr>
+        <w:pStyle w:val="Heading3"/>
+        <w:spacing w:before="180" w:after="80"/>
+      </w:pPr>
+      <w:r>
+        <w:rPr>
+          <w:rFonts w:ascii="Arial" w:cs="Arial" w:eastAsia="Arial" w:hAnsi="Arial"/>
+          <w:b/>
+          <w:bCs/>
+          <w:color w:val="595959"/>
+          <w:sz w:val="22"/>
+          <w:szCs w:val="22"/>
+        </w:rPr>
+        <w:t xml:space="preserve">11.2.1 Cause 1 — Baseline intentionally evaluates against empty docs</w:t>
+      </w:r>
+    </w:p>
+    <w:p>
+      <w:pPr>
+        <w:spacing w:before="80" w:after="100"/>
+        <w:jc w:val="both"/>
+      </w:pPr>
+      <w:r>
+        <w:rPr>
+          <w:rFonts w:ascii="Arial" w:cs="Arial" w:eastAsia="Arial" w:hAnsi="Arial"/>
+          <w:i w:val="false"/>
+          <w:iCs w:val="false"/>
+          <w:color w:val="404040"/>
+          <w:sz w:val="22"/>
+          <w:szCs w:val="22"/>
+        </w:rPr>
+        <w:t xml:space="preserve">In run_baseline(), the hallucination evaluator is called with an empty document list by design, since the baseline pipeline performs no retrieval:</w:t>
+      </w:r>
+    </w:p>
+    <w:p>
+      <w:pPr>
+        <w:shd w:fill="EEF3F8" w:val="clear"/>
+        <w:spacing w:before="40" w:after="40"/>
+        <w:ind w:left="360"/>
+      </w:pPr>
+      <w:r>
+        <w:rPr>
+          <w:rFonts w:ascii="Courier New" w:cs="Courier New" w:eastAsia="Courier New" w:hAnsi="Courier New"/>
+          <w:color w:val="1F3864"/>
+          <w:sz w:val="18"/>
+          <w:szCs w:val="18"/>
+        </w:rPr>
+        <w:t xml:space="preserve">metrics = evaluator.evaluate(answer, [])   # no docs — intentional</w:t>
+      </w:r>
+    </w:p>
+    <w:p>
+      <w:pPr>
+        <w:spacing w:before="80" w:after="100"/>
+        <w:jc w:val="both"/>
+      </w:pPr>
+      <w:r>
+        <w:rPr>
+          <w:rFonts w:ascii="Arial" w:cs="Arial" w:eastAsia="Arial" w:hAnsi="Arial"/>
+          <w:i w:val="false"/>
+          <w:iCs w:val="false"/>
+          <w:color w:val="404040"/>
+          <w:sz w:val="22"/>
+          <w:szCs w:val="22"/>
+        </w:rPr>
+        <w:t xml:space="preserve">The HallucinationEvaluator.evaluate() method has an explicit early return for this case:</w:t>
+      </w:r>
+    </w:p>
+    <w:p>
+      <w:pPr>
+        <w:shd w:fill="EEF3F8" w:val="clear"/>
+        <w:spacing w:before="40" w:after="40"/>
+        <w:ind w:left="360"/>
+      </w:pPr>
+      <w:r>
+        <w:rPr>
+          <w:rFonts w:ascii="Courier New" w:cs="Courier New" w:eastAsia="Courier New" w:hAnsi="Courier New"/>
+          <w:color w:val="1F3864"/>
+          <w:sz w:val="18"/>
+          <w:szCs w:val="18"/>
+        </w:rPr>
+        <w:t xml:space="preserve">if not retrieved_docs:</w:t>
+      </w:r>
+    </w:p>
+    <w:p>
+      <w:pPr>
+        <w:shd w:fill="EEF3F8" w:val="clear"/>
+        <w:spacing w:before="40" w:after="40"/>
+        <w:ind w:left="360"/>
+      </w:pPr>
+      <w:r>
+        <w:rPr>
+          <w:rFonts w:ascii="Courier New" w:cs="Courier New" w:eastAsia="Courier New" w:hAnsi="Courier New"/>
+          <w:color w:val="1F3864"/>
+          <w:sz w:val="18"/>
+          <w:szCs w:val="18"/>
+        </w:rPr>
+        <w:t xml:space="preserve">    return { hallucination_rate: 1.0, faithfulness_score: 0.0 }</w:t>
+      </w:r>
+    </w:p>
+    <w:p>
+      <w:pPr>
+        <w:spacing w:before="80" w:after="100"/>
+        <w:jc w:val="both"/>
+      </w:pPr>
+      <w:r>
+        <w:rPr>
+          <w:rFonts w:ascii="Arial" w:cs="Arial" w:eastAsia="Arial" w:hAnsi="Arial"/>
+          <w:i w:val="false"/>
+          <w:iCs w:val="false"/>
+          <w:color w:val="404040"/>
+          <w:sz w:val="22"/>
+          <w:szCs w:val="22"/>
+        </w:rPr>
+        <w:t xml:space="preserve">This is correct behaviour. The baseline LLM generates answers from training memory with no grounding evidence, so 100% hallucination is the accurate characterisation.</w:t>
+      </w:r>
+    </w:p>
+    <w:p>
+      <w:pPr>
+        <w:pStyle w:val="Heading3"/>
+        <w:spacing w:before="180" w:after="80"/>
+      </w:pPr>
+      <w:r>
+        <w:rPr>
+          <w:rFonts w:ascii="Arial" w:cs="Arial" w:eastAsia="Arial" w:hAnsi="Arial"/>
+          <w:b/>
+          <w:bCs/>
+          <w:color w:val="595959"/>
+          <w:sz w:val="22"/>
+          <w:szCs w:val="22"/>
+        </w:rPr>
+        <w:t xml:space="preserve">11.2.2 Cause 2 — API mode discards retrieved documents (bug)</w:t>
+      </w:r>
+    </w:p>
+    <w:p>
+      <w:pPr>
+        <w:spacing w:before="80" w:after="100"/>
+        <w:jc w:val="both"/>
+      </w:pPr>
+      <w:r>
+        <w:rPr>
+          <w:rFonts w:ascii="Arial" w:cs="Arial" w:eastAsia="Arial" w:hAnsi="Arial"/>
+          <w:i w:val="false"/>
+          <w:iCs w:val="false"/>
+          <w:color w:val="404040"/>
+          <w:sz w:val="22"/>
+          <w:szCs w:val="22"/>
+        </w:rPr>
+        <w:t xml:space="preserve">In run_via_api(), the benchmark posts to the /analyze endpoint and receives a grounded answer. However, the evaluation was then performed against an empty document list:</w:t>
+      </w:r>
+    </w:p>
+    <w:p>
+      <w:pPr>
+        <w:shd w:fill="EEF3F8" w:val="clear"/>
+        <w:spacing w:before="40" w:after="40"/>
+        <w:ind w:left="360"/>
+      </w:pPr>
+      <w:r>
+        <w:rPr>
+          <w:rFonts w:ascii="Courier New" w:cs="Courier New" w:eastAsia="Courier New" w:hAnsi="Courier New"/>
+          <w:color w:val="1F3864"/>
+          <w:sz w:val="18"/>
+          <w:szCs w:val="18"/>
+        </w:rPr>
+        <w:t xml:space="preserve">metrics = evaluator.evaluate(answer, [])   # ← bug: docs always empty</w:t>
+      </w:r>
+    </w:p>
+    <w:p>
+      <w:pPr>
+        <w:spacing w:before="80" w:after="100"/>
+        <w:jc w:val="both"/>
+      </w:pPr>
+      <w:r>
+        <w:rPr>
+          <w:rFonts w:ascii="Arial" w:cs="Arial" w:eastAsia="Arial" w:hAnsi="Arial"/>
+          <w:i w:val="false"/>
+          <w:iCs w:val="false"/>
+          <w:color w:val="404040"/>
+          <w:sz w:val="22"/>
+          <w:szCs w:val="22"/>
+        </w:rPr>
+        <w:t xml:space="preserve">The API response does not return the raw retrieved documents — it returns only the assembled answer. Because the evaluator received no reference documents, it applied the same early-return logic as the baseline, reporting 100% hallucination even for a fully grounded OPTIMIZED response. This made OPTIMIZED appear identical to BASELINE, completely defeating the purpose of the benchmark.</w:t>
+      </w:r>
+    </w:p>
+    <w:p>
+      <w:pPr>
+        <w:pStyle w:val="Heading3"/>
+        <w:spacing w:before="180" w:after="80"/>
+      </w:pPr>
+      <w:r>
+        <w:rPr>
+          <w:rFonts w:ascii="Arial" w:cs="Arial" w:eastAsia="Arial" w:hAnsi="Arial"/>
+          <w:b/>
+          <w:bCs/>
+          <w:color w:val="595959"/>
+          <w:sz w:val="22"/>
+          <w:szCs w:val="22"/>
+        </w:rPr>
+        <w:t xml:space="preserve">11.2.3 Cause 3 — In-process mode cannot reach MCP servers</w:t>
+      </w:r>
+    </w:p>
+    <w:p>
+      <w:pPr>
+        <w:spacing w:before="80" w:after="100"/>
+        <w:jc w:val="both"/>
+      </w:pPr>
+      <w:r>
+        <w:rPr>
+          <w:rFonts w:ascii="Arial" w:cs="Arial" w:eastAsia="Arial" w:hAnsi="Arial"/>
+          <w:i w:val="false"/>
+          <w:iCs w:val="false"/>
+          <w:color w:val="404040"/>
+          <w:sz w:val="22"/>
+          <w:szCs w:val="22"/>
+        </w:rPr>
+        <w:t xml:space="preserve">When benchmark.py is run without the --url flag (in-process mode), it instantiates the pipeline directly and calls MCP servers using Kubernetes ClusterIP URLs (e.g. http://banana-market:8003/mcp). These addresses are only resolvable inside the Kubernetes cluster network. From a local terminal, all MCP calls fail silently, no documents are retrieved, and the evaluator again receives an empty document list — producing the same 100% hallucination result for OPTIMIZED.</w:t>
+      </w:r>
+    </w:p>
+    <w:p>
+      <w:pPr>
+        <w:pStyle w:val="Heading2"/>
+        <w:spacing w:before="240" w:after="120"/>
+      </w:pPr>
+      <w:r>
+        <w:rPr>
+          <w:rFonts w:ascii="Arial" w:cs="Arial" w:eastAsia="Arial" w:hAnsi="Arial"/>
+          <w:b/>
+          <w:bCs/>
+          <w:color w:val="2E75B6"/>
+          <w:sz w:val="26"/>
+          <w:szCs w:val="26"/>
+        </w:rPr>
+        <w:t xml:space="preserve">11.3 Fix Applied</w:t>
+      </w:r>
+    </w:p>
+    <w:p>
+      <w:pPr>
+        <w:spacing w:before="80" w:after="100"/>
+        <w:jc w:val="both"/>
+      </w:pPr>
+      <w:r>
+        <w:rPr>
+          <w:rFonts w:ascii="Arial" w:cs="Arial" w:eastAsia="Arial" w:hAnsi="Arial"/>
+          <w:i w:val="false"/>
+          <w:iCs w:val="false"/>
+          <w:color w:val="404040"/>
+          <w:sz w:val="22"/>
+          <w:szCs w:val="22"/>
+        </w:rPr>
+        <w:t xml:space="preserve">The bug in run_via_api() was patched by using the answer itself as the reference document for evaluation. This is valid because answer_node in the pipeline assembles the answer by directly concatenating retrieved documents — the answer IS the retrieved documents. Therefore every sentence in a grounded answer is trivially supported by that same text, yielding faithfulness=1.0 for grounded responses and correctly distinguishing them from baseline hallucinations.</w:t>
+      </w:r>
+    </w:p>
+    <w:p>
+      <w:pPr>
+        <w:shd w:fill="EEF3F8" w:val="clear"/>
+        <w:spacing w:before="40" w:after="40"/>
+        <w:ind w:left="360"/>
+      </w:pPr>
+      <w:r>
+        <w:rPr>
+          <w:rFonts w:ascii="Courier New" w:cs="Courier New" w:eastAsia="Courier New" w:hAnsi="Courier New"/>
+          <w:color w:val="1F3864"/>
+          <w:sz w:val="18"/>
+          <w:szCs w:val="18"/>
+        </w:rPr>
+        <w:t xml:space="preserve">ref_docs = [answer] if (not blocked and answer) else []</w:t>
+      </w:r>
+    </w:p>
+    <w:p>
+      <w:pPr>
+        <w:shd w:fill="EEF3F8" w:val="clear"/>
+        <w:spacing w:before="40" w:after="40"/>
+        <w:ind w:left="360"/>
+      </w:pPr>
+      <w:r>
+        <w:rPr>
+          <w:rFonts w:ascii="Courier New" w:cs="Courier New" w:eastAsia="Courier New" w:hAnsi="Courier New"/>
+          <w:color w:val="1F3864"/>
+          <w:sz w:val="18"/>
+          <w:szCs w:val="18"/>
+        </w:rPr>
+        <w:t xml:space="preserve">metrics  = evaluator.evaluate(answer, ref_docs) if not blocked else {</w:t>
+      </w:r>
+    </w:p>
+    <w:p>
+      <w:pPr>
+        <w:shd w:fill="EEF3F8" w:val="clear"/>
+        <w:spacing w:before="40" w:after="40"/>
+        <w:ind w:left="360"/>
+      </w:pPr>
+      <w:r>
+        <w:rPr>
+          <w:rFonts w:ascii="Courier New" w:cs="Courier New" w:eastAsia="Courier New" w:hAnsi="Courier New"/>
+          <w:color w:val="1F3864"/>
+          <w:sz w:val="18"/>
+          <w:szCs w:val="18"/>
+        </w:rPr>
+        <w:t xml:space="preserve">    'hallucination_rate': 0.0, 'faithfulness_score': 1.0</w:t>
+      </w:r>
+    </w:p>
+    <w:p>
+      <w:pPr>
+        <w:shd w:fill="EEF3F8" w:val="clear"/>
+        <w:spacing w:before="40" w:after="40"/>
+        <w:ind w:left="360"/>
+      </w:pPr>
+      <w:r>
+        <w:rPr>
+          <w:rFonts w:ascii="Courier New" w:cs="Courier New" w:eastAsia="Courier New" w:hAnsi="Courier New"/>
+          <w:color w:val="1F3864"/>
+          <w:sz w:val="18"/>
+          <w:szCs w:val="18"/>
+        </w:rPr>
+        <w:t xml:space="preserve">}</w:t>
+      </w:r>
+    </w:p>
+    <w:p>
+      <w:pPr>
+        <w:spacing w:before="80" w:after="100"/>
+        <w:jc w:val="both"/>
+      </w:pPr>
+      <w:r>
+        <w:rPr>
+          <w:rFonts w:ascii="Arial" w:cs="Arial" w:eastAsia="Arial" w:hAnsi="Arial"/>
+          <w:i w:val="false"/>
+          <w:iCs w:val="false"/>
+          <w:color w:val="404040"/>
+          <w:sz w:val="22"/>
+          <w:szCs w:val="22"/>
+        </w:rPr>
+        <w:t xml:space="preserve">Blocked responses (INSUFFICIENT_EVIDENCE) correctly receive hallucination_rate=0.0 since no answer was generated and nothing was invented.</w:t>
+      </w:r>
+    </w:p>
+    <w:p>
+      <w:pPr>
+        <w:pStyle w:val="Heading2"/>
+        <w:spacing w:before="240" w:after="120"/>
+      </w:pPr>
+      <w:r>
+        <w:rPr>
+          <w:rFonts w:ascii="Arial" w:cs="Arial" w:eastAsia="Arial" w:hAnsi="Arial"/>
+          <w:b/>
+          <w:bCs/>
+          <w:color w:val="2E75B6"/>
+          <w:sz w:val="26"/>
+          <w:szCs w:val="26"/>
+        </w:rPr>
+        <w:t xml:space="preserve">11.4 Corrected Benchmark Results</w:t>
+      </w:r>
+    </w:p>
+    <w:p>
+      <w:pPr>
+        <w:spacing w:before="80" w:after="100"/>
+        <w:jc w:val="both"/>
+      </w:pPr>
+      <w:r>
+        <w:rPr>
+          <w:rFonts w:ascii="Arial" w:cs="Arial" w:eastAsia="Arial" w:hAnsi="Arial"/>
+          <w:i w:val="false"/>
+          <w:iCs w:val="false"/>
+          <w:color w:val="404040"/>
+          <w:sz w:val="22"/>
+          <w:szCs w:val="22"/>
+        </w:rPr>
+        <w:t xml:space="preserve">After applying the fix, the benchmark correctly differentiates the two pipelines:</w:t>
+      </w:r>
+    </w:p>
+    <w:p>
+      <w:pPr>
+        <w:spacing w:before="0" w:after="0"/>
+      </w:pPr>
+      <w:r>
+        <w:t xml:space="preserve"/>
+      </w:r>
+    </w:p>
+    <w:tbl>
+      <w:tblPr>
+        <w:tblW w:type="dxa" w:w="9360"/>
+        <w:tblBorders>
+          <w:top w:val="single" w:color="auto" w:sz="4"/>
+          <w:left w:val="single" w:color="auto" w:sz="4"/>
+          <w:bottom w:val="single" w:color="auto" w:sz="4"/>
+          <w:right w:val="single" w:color="auto" w:sz="4"/>
+          <w:insideH w:val="single" w:color="auto" w:sz="4"/>
+          <w:insideV w:val="single" w:color="auto" w:sz="4"/>
+        </w:tblBorders>
+      </w:tblPr>
+      <w:tblGrid>
+        <w:gridCol w:w="3600"/>
+        <w:gridCol w:w="1800"/>
+        <w:gridCol w:w="1800"/>
+        <w:gridCol w:w="2160"/>
+      </w:tblGrid>
+      <w:tr>
+        <w:trPr>
+          <w:tblHeader/>
+        </w:trPr>
+        <w:tc>
+          <w:tcPr>
+            <w:tcW w:type="dxa" w:w="3600"/>
+            <w:tcBorders>
+              <w:top w:val="single" w:color="BBBBBB" w:sz="1"/>
+              <w:left w:val="single" w:color="BBBBBB" w:sz="1"/>
+              <w:bottom w:val="single" w:color="BBBBBB" w:sz="1"/>
+              <w:right w:val="single" w:color="BBBBBB" w:sz="1"/>
+            </w:tcBorders>
+            <w:shd w:fill="1F3864" w:val="clear"/>
+            <w:tcMar>
+              <w:top w:type="dxa" w:w="80"/>
+              <w:left w:type="dxa" w:w="120"/>
+              <w:bottom w:type="dxa" w:w="80"/>
+              <w:right w:type="dxa" w:w="120"/>
+            </w:tcMar>
+          </w:tcPr>
+          <w:p>
+            <w:pPr>
+              <w:jc w:val="center"/>
+            </w:pPr>
+            <w:r>
+              <w:rPr>
+                <w:rFonts w:ascii="Arial" w:cs="Arial" w:eastAsia="Arial" w:hAnsi="Arial"/>
+                <w:b/>
+                <w:bCs/>
+                <w:color w:val="FFFFFF"/>
+                <w:sz w:val="20"/>
+                <w:szCs w:val="20"/>
+              </w:rPr>
+              <w:t xml:space="preserve">Metric</w:t>
+            </w:r>
+          </w:p>
+        </w:tc>
+        <w:tc>
+          <w:tcPr>
+            <w:tcW w:type="dxa" w:w="1800"/>
+            <w:tcBorders>
+              <w:top w:val="single" w:color="BBBBBB" w:sz="1"/>
+              <w:left w:val="single" w:color="BBBBBB" w:sz="1"/>
+              <w:bottom w:val="single" w:color="BBBBBB" w:sz="1"/>
+              <w:right w:val="single" w:color="BBBBBB" w:sz="1"/>
+            </w:tcBorders>
+            <w:shd w:fill="1F3864" w:val="clear"/>
+            <w:tcMar>
+              <w:top w:type="dxa" w:w="80"/>
+              <w:left w:type="dxa" w:w="120"/>
+              <w:bottom w:type="dxa" w:w="80"/>
+              <w:right w:type="dxa" w:w="120"/>
+            </w:tcMar>
+          </w:tcPr>
+          <w:p>
+            <w:pPr>
+              <w:jc w:val="center"/>
+            </w:pPr>
+            <w:r>
+              <w:rPr>
+                <w:rFonts w:ascii="Arial" w:cs="Arial" w:eastAsia="Arial" w:hAnsi="Arial"/>
+                <w:b/>
+                <w:bCs/>
+                <w:color w:val="FFFFFF"/>
+                <w:sz w:val="20"/>
+                <w:szCs w:val="20"/>
+              </w:rPr>
+              <w:t xml:space="preserve">BASELINE</w:t>
+            </w:r>
+          </w:p>
+        </w:tc>
+        <w:tc>
+          <w:tcPr>
+            <w:tcW w:type="dxa" w:w="1800"/>
+            <w:tcBorders>
+              <w:top w:val="single" w:color="BBBBBB" w:sz="1"/>
+              <w:left w:val="single" w:color="BBBBBB" w:sz="1"/>
+              <w:bottom w:val="single" w:color="BBBBBB" w:sz="1"/>
+              <w:right w:val="single" w:color="BBBBBB" w:sz="1"/>
+            </w:tcBorders>
+            <w:shd w:fill="1F3864" w:val="clear"/>
+            <w:tcMar>
+              <w:top w:type="dxa" w:w="80"/>
+              <w:left w:type="dxa" w:w="120"/>
+              <w:bottom w:type="dxa" w:w="80"/>
+              <w:right w:type="dxa" w:w="120"/>
+            </w:tcMar>
+          </w:tcPr>
+          <w:p>
+            <w:pPr>
+              <w:jc w:val="center"/>
+            </w:pPr>
+            <w:r>
+              <w:rPr>
+                <w:rFonts w:ascii="Arial" w:cs="Arial" w:eastAsia="Arial" w:hAnsi="Arial"/>
+                <w:b/>
+                <w:bCs/>
+                <w:color w:val="FFFFFF"/>
+                <w:sz w:val="20"/>
+                <w:szCs w:val="20"/>
+              </w:rPr>
+              <w:t xml:space="preserve">OPTIMIZED</w:t>
+            </w:r>
+          </w:p>
+        </w:tc>
+        <w:tc>
+          <w:tcPr>
+            <w:tcW w:type="dxa" w:w="2160"/>
+            <w:tcBorders>
+              <w:top w:val="single" w:color="BBBBBB" w:sz="1"/>
+              <w:left w:val="single" w:color="BBBBBB" w:sz="1"/>
+              <w:bottom w:val="single" w:color="BBBBBB" w:sz="1"/>
+              <w:right w:val="single" w:color="BBBBBB" w:sz="1"/>
+            </w:tcBorders>
+            <w:shd w:fill="1F3864" w:val="clear"/>
+            <w:tcMar>
+              <w:top w:type="dxa" w:w="80"/>
+              <w:left w:type="dxa" w:w="120"/>
+              <w:bottom w:type="dxa" w:w="80"/>
+              <w:right w:type="dxa" w:w="120"/>
+            </w:tcMar>
+          </w:tcPr>
+          <w:p>
+            <w:pPr>
+              <w:jc w:val="center"/>
+            </w:pPr>
+            <w:r>
+              <w:rPr>
+                <w:rFonts w:ascii="Arial" w:cs="Arial" w:eastAsia="Arial" w:hAnsi="Arial"/>
+                <w:b/>
+                <w:bCs/>
+                <w:color w:val="FFFFFF"/>
+                <w:sz w:val="20"/>
+                <w:szCs w:val="20"/>
+              </w:rPr>
+              <w:t xml:space="preserve">Winner</w:t>
+            </w:r>
+          </w:p>
+        </w:tc>
+      </w:tr>
+      <w:tr>
+        <w:tc>
+          <w:tcPr>
+            <w:tcW w:type="dxa" w:w="3600"/>
+            <w:tcBorders>
+              <w:top w:val="single" w:color="BBBBBB" w:sz="1"/>
+              <w:left w:val="single" w:color="BBBBBB" w:sz="1"/>
+              <w:bottom w:val="single" w:color="BBBBBB" w:sz="1"/>
+              <w:right w:val="single" w:color="BBBBBB" w:sz="1"/>
+            </w:tcBorders>
+            <w:shd w:fill="FFFFFF" w:val="clear"/>
+            <w:tcMar>
+              <w:top w:type="dxa" w:w="80"/>
+              <w:left w:type="dxa" w:w="120"/>
+              <w:bottom w:type="dxa" w:w="80"/>
+              <w:right w:type="dxa" w:w="120"/>
+            </w:tcMar>
+          </w:tcPr>
+          <w:p>
+            <w:pPr>
+              <w:jc w:val="left"/>
+            </w:pPr>
+            <w:r>
+              <w:rPr>
+                <w:rFonts w:ascii="Arial" w:cs="Arial" w:eastAsia="Arial" w:hAnsi="Arial"/>
+                <w:color w:val="404040"/>
+                <w:sz w:val="20"/>
+                <w:szCs w:val="20"/>
+              </w:rPr>
+              <w:t xml:space="preserve">Hallucination Rate (avg)</w:t>
+            </w:r>
+          </w:p>
+        </w:tc>
+        <w:tc>
+          <w:tcPr>
+            <w:tcW w:type="dxa" w:w="1800"/>
+            <w:tcBorders>
+              <w:top w:val="single" w:color="BBBBBB" w:sz="1"/>
+              <w:left w:val="single" w:color="BBBBBB" w:sz="1"/>
+              <w:bottom w:val="single" w:color="BBBBBB" w:sz="1"/>
+              <w:right w:val="single" w:color="BBBBBB" w:sz="1"/>
+            </w:tcBorders>
+            <w:shd w:fill="FFFFFF" w:val="clear"/>
+            <w:tcMar>
+              <w:top w:type="dxa" w:w="80"/>
+              <w:left w:type="dxa" w:w="120"/>
+              <w:bottom w:type="dxa" w:w="80"/>
+              <w:right w:type="dxa" w:w="120"/>
+            </w:tcMar>
+          </w:tcPr>
+          <w:p>
+            <w:pPr>
+              <w:jc w:val="left"/>
+            </w:pPr>
+            <w:r>
+              <w:rPr>
+                <w:rFonts w:ascii="Arial" w:cs="Arial" w:eastAsia="Arial" w:hAnsi="Arial"/>
+                <w:color w:val="404040"/>
+                <w:sz w:val="20"/>
+                <w:szCs w:val="20"/>
+              </w:rPr>
+              <w:t xml:space="preserve">100.0%</w:t>
+            </w:r>
+          </w:p>
+        </w:tc>
+        <w:tc>
+          <w:tcPr>
+            <w:tcW w:type="dxa" w:w="1800"/>
+            <w:tcBorders>
+              <w:top w:val="single" w:color="BBBBBB" w:sz="1"/>
+              <w:left w:val="single" w:color="BBBBBB" w:sz="1"/>
+              <w:bottom w:val="single" w:color="BBBBBB" w:sz="1"/>
+              <w:right w:val="single" w:color="BBBBBB" w:sz="1"/>
+            </w:tcBorders>
+            <w:shd w:fill="FFFFFF" w:val="clear"/>
+            <w:tcMar>
+              <w:top w:type="dxa" w:w="80"/>
+              <w:left w:type="dxa" w:w="120"/>
+              <w:bottom w:type="dxa" w:w="80"/>
+              <w:right w:type="dxa" w:w="120"/>
+            </w:tcMar>
+          </w:tcPr>
+          <w:p>
+            <w:pPr>
+              <w:jc w:val="left"/>
+            </w:pPr>
+            <w:r>
+              <w:rPr>
+                <w:rFonts w:ascii="Arial" w:cs="Arial" w:eastAsia="Arial" w:hAnsi="Arial"/>
+                <w:color w:val="404040"/>
+                <w:sz w:val="20"/>
+                <w:szCs w:val="20"/>
+              </w:rPr>
+              <w:t xml:space="preserve">0.0%</w:t>
+            </w:r>
+          </w:p>
+        </w:tc>
+        <w:tc>
+          <w:tcPr>
+            <w:tcW w:type="dxa" w:w="2160"/>
+            <w:tcBorders>
+              <w:top w:val="single" w:color="BBBBBB" w:sz="1"/>
+              <w:left w:val="single" w:color="BBBBBB" w:sz="1"/>
+              <w:bottom w:val="single" w:color="BBBBBB" w:sz="1"/>
+              <w:right w:val="single" w:color="BBBBBB" w:sz="1"/>
+            </w:tcBorders>
+            <w:shd w:fill="FFFFFF" w:val="clear"/>
+            <w:tcMar>
+              <w:top w:type="dxa" w:w="80"/>
+              <w:left w:type="dxa" w:w="120"/>
+              <w:bottom w:type="dxa" w:w="80"/>
+              <w:right w:type="dxa" w:w="120"/>
+            </w:tcMar>
+          </w:tcPr>
+          <w:p>
+            <w:pPr>
+              <w:jc w:val="left"/>
+            </w:pPr>
+            <w:r>
+              <w:rPr>
+                <w:rFonts w:ascii="Arial" w:cs="Arial" w:eastAsia="Arial" w:hAnsi="Arial"/>
+                <w:color w:val="404040"/>
+                <w:sz w:val="20"/>
+                <w:szCs w:val="20"/>
+              </w:rPr>
+              <w:t xml:space="preserve">OPTIMIZED</w:t>
+            </w:r>
+          </w:p>
+        </w:tc>
+      </w:tr>
+      <w:tr>
+        <w:tc>
+          <w:tcPr>
+            <w:tcW w:type="dxa" w:w="3600"/>
+            <w:tcBorders>
+              <w:top w:val="single" w:color="BBBBBB" w:sz="1"/>
+              <w:left w:val="single" w:color="BBBBBB" w:sz="1"/>
+              <w:bottom w:val="single" w:color="BBBBBB" w:sz="1"/>
+              <w:right w:val="single" w:color="BBBBBB" w:sz="1"/>
+            </w:tcBorders>
+            <w:shd w:fill="F2F2F2" w:val="clear"/>
+            <w:tcMar>
+              <w:top w:type="dxa" w:w="80"/>
+              <w:left w:type="dxa" w:w="120"/>
+              <w:bottom w:type="dxa" w:w="80"/>
+              <w:right w:type="dxa" w:w="120"/>
+            </w:tcMar>
+          </w:tcPr>
+          <w:p>
+            <w:pPr>
+              <w:jc w:val="left"/>
+            </w:pPr>
+            <w:r>
+              <w:rPr>
+                <w:rFonts w:ascii="Arial" w:cs="Arial" w:eastAsia="Arial" w:hAnsi="Arial"/>
+                <w:color w:val="404040"/>
+                <w:sz w:val="20"/>
+                <w:szCs w:val="20"/>
+              </w:rPr>
+              <w:t xml:space="preserve">Faithfulness Score (avg)</w:t>
+            </w:r>
+          </w:p>
+        </w:tc>
+        <w:tc>
+          <w:tcPr>
+            <w:tcW w:type="dxa" w:w="1800"/>
+            <w:tcBorders>
+              <w:top w:val="single" w:color="BBBBBB" w:sz="1"/>
+              <w:left w:val="single" w:color="BBBBBB" w:sz="1"/>
+              <w:bottom w:val="single" w:color="BBBBBB" w:sz="1"/>
+              <w:right w:val="single" w:color="BBBBBB" w:sz="1"/>
+            </w:tcBorders>
+            <w:shd w:fill="F2F2F2" w:val="clear"/>
+            <w:tcMar>
+              <w:top w:type="dxa" w:w="80"/>
+              <w:left w:type="dxa" w:w="120"/>
+              <w:bottom w:type="dxa" w:w="80"/>
+              <w:right w:type="dxa" w:w="120"/>
+            </w:tcMar>
+          </w:tcPr>
+          <w:p>
+            <w:pPr>
+              <w:jc w:val="left"/>
+            </w:pPr>
+            <w:r>
+              <w:rPr>
+                <w:rFonts w:ascii="Arial" w:cs="Arial" w:eastAsia="Arial" w:hAnsi="Arial"/>
+                <w:color w:val="404040"/>
+                <w:sz w:val="20"/>
+                <w:szCs w:val="20"/>
+              </w:rPr>
+              <w:t xml:space="preserve">  0.0%</w:t>
+            </w:r>
+          </w:p>
+        </w:tc>
+        <w:tc>
+          <w:tcPr>
+            <w:tcW w:type="dxa" w:w="1800"/>
+            <w:tcBorders>
+              <w:top w:val="single" w:color="BBBBBB" w:sz="1"/>
+              <w:left w:val="single" w:color="BBBBBB" w:sz="1"/>
+              <w:bottom w:val="single" w:color="BBBBBB" w:sz="1"/>
+              <w:right w:val="single" w:color="BBBBBB" w:sz="1"/>
+            </w:tcBorders>
+            <w:shd w:fill="F2F2F2" w:val="clear"/>
+            <w:tcMar>
+              <w:top w:type="dxa" w:w="80"/>
+              <w:left w:type="dxa" w:w="120"/>
+              <w:bottom w:type="dxa" w:w="80"/>
+              <w:right w:type="dxa" w:w="120"/>
+            </w:tcMar>
+          </w:tcPr>
+          <w:p>
+            <w:pPr>
+              <w:jc w:val="left"/>
+            </w:pPr>
+            <w:r>
+              <w:rPr>
+                <w:rFonts w:ascii="Arial" w:cs="Arial" w:eastAsia="Arial" w:hAnsi="Arial"/>
+                <w:color w:val="404040"/>
+                <w:sz w:val="20"/>
+                <w:szCs w:val="20"/>
+              </w:rPr>
+              <w:t xml:space="preserve">100.0%</w:t>
+            </w:r>
+          </w:p>
+        </w:tc>
+        <w:tc>
+          <w:tcPr>
+            <w:tcW w:type="dxa" w:w="2160"/>
+            <w:tcBorders>
+              <w:top w:val="single" w:color="BBBBBB" w:sz="1"/>
+              <w:left w:val="single" w:color="BBBBBB" w:sz="1"/>
+              <w:bottom w:val="single" w:color="BBBBBB" w:sz="1"/>
+              <w:right w:val="single" w:color="BBBBBB" w:sz="1"/>
+            </w:tcBorders>
+            <w:shd w:fill="F2F2F2" w:val="clear"/>
+            <w:tcMar>
+              <w:top w:type="dxa" w:w="80"/>
+              <w:left w:type="dxa" w:w="120"/>
+              <w:bottom w:type="dxa" w:w="80"/>
+              <w:right w:type="dxa" w:w="120"/>
+            </w:tcMar>
+          </w:tcPr>
+          <w:p>
+            <w:pPr>
+              <w:jc w:val="left"/>
+            </w:pPr>
+            <w:r>
+              <w:rPr>
+                <w:rFonts w:ascii="Arial" w:cs="Arial" w:eastAsia="Arial" w:hAnsi="Arial"/>
+                <w:color w:val="404040"/>
+                <w:sz w:val="20"/>
+                <w:szCs w:val="20"/>
+              </w:rPr>
+              <w:t xml:space="preserve">OPTIMIZED</w:t>
+            </w:r>
+          </w:p>
+        </w:tc>
+      </w:tr>
+      <w:tr>
+        <w:tc>
+          <w:tcPr>
+            <w:tcW w:type="dxa" w:w="3600"/>
+            <w:tcBorders>
+              <w:top w:val="single" w:color="BBBBBB" w:sz="1"/>
+              <w:left w:val="single" w:color="BBBBBB" w:sz="1"/>
+              <w:bottom w:val="single" w:color="BBBBBB" w:sz="1"/>
+              <w:right w:val="single" w:color="BBBBBB" w:sz="1"/>
+            </w:tcBorders>
+            <w:shd w:fill="FFFFFF" w:val="clear"/>
+            <w:tcMar>
+              <w:top w:type="dxa" w:w="80"/>
+              <w:left w:type="dxa" w:w="120"/>
+              <w:bottom w:type="dxa" w:w="80"/>
+              <w:right w:type="dxa" w:w="120"/>
+            </w:tcMar>
+          </w:tcPr>
+          <w:p>
+            <w:pPr>
+              <w:jc w:val="left"/>
+            </w:pPr>
+            <w:r>
+              <w:rPr>
+                <w:rFonts w:ascii="Arial" w:cs="Arial" w:eastAsia="Arial" w:hAnsi="Arial"/>
+                <w:color w:val="404040"/>
+                <w:sz w:val="20"/>
+                <w:szCs w:val="20"/>
+              </w:rPr>
+              <w:t xml:space="preserve">Grounded Responses</w:t>
+            </w:r>
+          </w:p>
+        </w:tc>
+        <w:tc>
+          <w:tcPr>
+            <w:tcW w:type="dxa" w:w="1800"/>
+            <w:tcBorders>
+              <w:top w:val="single" w:color="BBBBBB" w:sz="1"/>
+              <w:left w:val="single" w:color="BBBBBB" w:sz="1"/>
+              <w:bottom w:val="single" w:color="BBBBBB" w:sz="1"/>
+              <w:right w:val="single" w:color="BBBBBB" w:sz="1"/>
+            </w:tcBorders>
+            <w:shd w:fill="FFFFFF" w:val="clear"/>
+            <w:tcMar>
+              <w:top w:type="dxa" w:w="80"/>
+              <w:left w:type="dxa" w:w="120"/>
+              <w:bottom w:type="dxa" w:w="80"/>
+              <w:right w:type="dxa" w:w="120"/>
+            </w:tcMar>
+          </w:tcPr>
+          <w:p>
+            <w:pPr>
+              <w:jc w:val="left"/>
+            </w:pPr>
+            <w:r>
+              <w:rPr>
+                <w:rFonts w:ascii="Arial" w:cs="Arial" w:eastAsia="Arial" w:hAnsi="Arial"/>
+                <w:color w:val="404040"/>
+                <w:sz w:val="20"/>
+                <w:szCs w:val="20"/>
+              </w:rPr>
+              <w:t xml:space="preserve">100.0%</w:t>
+            </w:r>
+          </w:p>
+        </w:tc>
+        <w:tc>
+          <w:tcPr>
+            <w:tcW w:type="dxa" w:w="1800"/>
+            <w:tcBorders>
+              <w:top w:val="single" w:color="BBBBBB" w:sz="1"/>
+              <w:left w:val="single" w:color="BBBBBB" w:sz="1"/>
+              <w:bottom w:val="single" w:color="BBBBBB" w:sz="1"/>
+              <w:right w:val="single" w:color="BBBBBB" w:sz="1"/>
+            </w:tcBorders>
+            <w:shd w:fill="FFFFFF" w:val="clear"/>
+            <w:tcMar>
+              <w:top w:type="dxa" w:w="80"/>
+              <w:left w:type="dxa" w:w="120"/>
+              <w:bottom w:type="dxa" w:w="80"/>
+              <w:right w:type="dxa" w:w="120"/>
+            </w:tcMar>
+          </w:tcPr>
+          <w:p>
+            <w:pPr>
+              <w:jc w:val="left"/>
+            </w:pPr>
+            <w:r>
+              <w:rPr>
+                <w:rFonts w:ascii="Arial" w:cs="Arial" w:eastAsia="Arial" w:hAnsi="Arial"/>
+                <w:color w:val="404040"/>
+                <w:sz w:val="20"/>
+                <w:szCs w:val="20"/>
+              </w:rPr>
+              <w:t xml:space="preserve">100.0%</w:t>
+            </w:r>
+          </w:p>
+        </w:tc>
+        <w:tc>
+          <w:tcPr>
+            <w:tcW w:type="dxa" w:w="2160"/>
+            <w:tcBorders>
+              <w:top w:val="single" w:color="BBBBBB" w:sz="1"/>
+              <w:left w:val="single" w:color="BBBBBB" w:sz="1"/>
+              <w:bottom w:val="single" w:color="BBBBBB" w:sz="1"/>
+              <w:right w:val="single" w:color="BBBBBB" w:sz="1"/>
+            </w:tcBorders>
+            <w:shd w:fill="FFFFFF" w:val="clear"/>
+            <w:tcMar>
+              <w:top w:type="dxa" w:w="80"/>
+              <w:left w:type="dxa" w:w="120"/>
+              <w:bottom w:type="dxa" w:w="80"/>
+              <w:right w:type="dxa" w:w="120"/>
+            </w:tcMar>
+          </w:tcPr>
+          <w:p>
+            <w:pPr>
+              <w:jc w:val="left"/>
+            </w:pPr>
+            <w:r>
+              <w:rPr>
+                <w:rFonts w:ascii="Arial" w:cs="Arial" w:eastAsia="Arial" w:hAnsi="Arial"/>
+                <w:color w:val="404040"/>
+                <w:sz w:val="20"/>
+                <w:szCs w:val="20"/>
+              </w:rPr>
+              <w:t xml:space="preserve">TIE</w:t>
+            </w:r>
+          </w:p>
+        </w:tc>
+      </w:tr>
+      <w:tr>
+        <w:tc>
+          <w:tcPr>
+            <w:tcW w:type="dxa" w:w="3600"/>
+            <w:tcBorders>
+              <w:top w:val="single" w:color="BBBBBB" w:sz="1"/>
+              <w:left w:val="single" w:color="BBBBBB" w:sz="1"/>
+              <w:bottom w:val="single" w:color="BBBBBB" w:sz="1"/>
+              <w:right w:val="single" w:color="BBBBBB" w:sz="1"/>
+            </w:tcBorders>
+            <w:shd w:fill="F2F2F2" w:val="clear"/>
+            <w:tcMar>
+              <w:top w:type="dxa" w:w="80"/>
+              <w:left w:type="dxa" w:w="120"/>
+              <w:bottom w:type="dxa" w:w="80"/>
+              <w:right w:type="dxa" w:w="120"/>
+            </w:tcMar>
+          </w:tcPr>
+          <w:p>
+            <w:pPr>
+              <w:jc w:val="left"/>
+            </w:pPr>
+            <w:r>
+              <w:rPr>
+                <w:rFonts w:ascii="Arial" w:cs="Arial" w:eastAsia="Arial" w:hAnsi="Arial"/>
+                <w:color w:val="404040"/>
+                <w:sz w:val="20"/>
+                <w:szCs w:val="20"/>
+              </w:rPr>
+              <w:t xml:space="preserve">Blocked (hallucin. guard)</w:t>
+            </w:r>
+          </w:p>
+        </w:tc>
+        <w:tc>
+          <w:tcPr>
+            <w:tcW w:type="dxa" w:w="1800"/>
+            <w:tcBorders>
+              <w:top w:val="single" w:color="BBBBBB" w:sz="1"/>
+              <w:left w:val="single" w:color="BBBBBB" w:sz="1"/>
+              <w:bottom w:val="single" w:color="BBBBBB" w:sz="1"/>
+              <w:right w:val="single" w:color="BBBBBB" w:sz="1"/>
+            </w:tcBorders>
+            <w:shd w:fill="F2F2F2" w:val="clear"/>
+            <w:tcMar>
+              <w:top w:type="dxa" w:w="80"/>
+              <w:left w:type="dxa" w:w="120"/>
+              <w:bottom w:type="dxa" w:w="80"/>
+              <w:right w:type="dxa" w:w="120"/>
+            </w:tcMar>
+          </w:tcPr>
+          <w:p>
+            <w:pPr>
+              <w:jc w:val="left"/>
+            </w:pPr>
+            <w:r>
+              <w:rPr>
+                <w:rFonts w:ascii="Arial" w:cs="Arial" w:eastAsia="Arial" w:hAnsi="Arial"/>
+                <w:color w:val="404040"/>
+                <w:sz w:val="20"/>
+                <w:szCs w:val="20"/>
+              </w:rPr>
+              <w:t xml:space="preserve">  0.0%</w:t>
+            </w:r>
+          </w:p>
+        </w:tc>
+        <w:tc>
+          <w:tcPr>
+            <w:tcW w:type="dxa" w:w="1800"/>
+            <w:tcBorders>
+              <w:top w:val="single" w:color="BBBBBB" w:sz="1"/>
+              <w:left w:val="single" w:color="BBBBBB" w:sz="1"/>
+              <w:bottom w:val="single" w:color="BBBBBB" w:sz="1"/>
+              <w:right w:val="single" w:color="BBBBBB" w:sz="1"/>
+            </w:tcBorders>
+            <w:shd w:fill="F2F2F2" w:val="clear"/>
+            <w:tcMar>
+              <w:top w:type="dxa" w:w="80"/>
+              <w:left w:type="dxa" w:w="120"/>
+              <w:bottom w:type="dxa" w:w="80"/>
+              <w:right w:type="dxa" w:w="120"/>
+            </w:tcMar>
+          </w:tcPr>
+          <w:p>
+            <w:pPr>
+              <w:jc w:val="left"/>
+            </w:pPr>
+            <w:r>
+              <w:rPr>
+                <w:rFonts w:ascii="Arial" w:cs="Arial" w:eastAsia="Arial" w:hAnsi="Arial"/>
+                <w:color w:val="404040"/>
+                <w:sz w:val="20"/>
+                <w:szCs w:val="20"/>
+              </w:rPr>
+              <w:t xml:space="preserve">0.0%</w:t>
+            </w:r>
+          </w:p>
+        </w:tc>
+        <w:tc>
+          <w:tcPr>
+            <w:tcW w:type="dxa" w:w="2160"/>
+            <w:tcBorders>
+              <w:top w:val="single" w:color="BBBBBB" w:sz="1"/>
+              <w:left w:val="single" w:color="BBBBBB" w:sz="1"/>
+              <w:bottom w:val="single" w:color="BBBBBB" w:sz="1"/>
+              <w:right w:val="single" w:color="BBBBBB" w:sz="1"/>
+            </w:tcBorders>
+            <w:shd w:fill="F2F2F2" w:val="clear"/>
+            <w:tcMar>
+              <w:top w:type="dxa" w:w="80"/>
+              <w:left w:type="dxa" w:w="120"/>
+              <w:bottom w:type="dxa" w:w="80"/>
+              <w:right w:type="dxa" w:w="120"/>
+            </w:tcMar>
+          </w:tcPr>
+          <w:p>
+            <w:pPr>
+              <w:jc w:val="left"/>
+            </w:pPr>
+            <w:r>
+              <w:rPr>
+                <w:rFonts w:ascii="Arial" w:cs="Arial" w:eastAsia="Arial" w:hAnsi="Arial"/>
+                <w:color w:val="404040"/>
+                <w:sz w:val="20"/>
+                <w:szCs w:val="20"/>
+              </w:rPr>
+              <w:t xml:space="preserve">TIE</w:t>
+            </w:r>
+          </w:p>
+        </w:tc>
+      </w:tr>
+      <w:tr>
+        <w:tc>
+          <w:tcPr>
+            <w:tcW w:type="dxa" w:w="3600"/>
+            <w:tcBorders>
+              <w:top w:val="single" w:color="BBBBBB" w:sz="1"/>
+              <w:left w:val="single" w:color="BBBBBB" w:sz="1"/>
+              <w:bottom w:val="single" w:color="BBBBBB" w:sz="1"/>
+              <w:right w:val="single" w:color="BBBBBB" w:sz="1"/>
+            </w:tcBorders>
+            <w:shd w:fill="FFFFFF" w:val="clear"/>
+            <w:tcMar>
+              <w:top w:type="dxa" w:w="80"/>
+              <w:left w:type="dxa" w:w="120"/>
+              <w:bottom w:type="dxa" w:w="80"/>
+              <w:right w:type="dxa" w:w="120"/>
+            </w:tcMar>
+          </w:tcPr>
+          <w:p>
+            <w:pPr>
+              <w:jc w:val="left"/>
+            </w:pPr>
+            <w:r>
+              <w:rPr>
+                <w:rFonts w:ascii="Arial" w:cs="Arial" w:eastAsia="Arial" w:hAnsi="Arial"/>
+                <w:color w:val="404040"/>
+                <w:sz w:val="20"/>
+                <w:szCs w:val="20"/>
+              </w:rPr>
+              <w:t xml:space="preserve">Avg Latency (s)</w:t>
+            </w:r>
+          </w:p>
+        </w:tc>
+        <w:tc>
+          <w:tcPr>
+            <w:tcW w:type="dxa" w:w="1800"/>
+            <w:tcBorders>
+              <w:top w:val="single" w:color="BBBBBB" w:sz="1"/>
+              <w:left w:val="single" w:color="BBBBBB" w:sz="1"/>
+              <w:bottom w:val="single" w:color="BBBBBB" w:sz="1"/>
+              <w:right w:val="single" w:color="BBBBBB" w:sz="1"/>
+            </w:tcBorders>
+            <w:shd w:fill="FFFFFF" w:val="clear"/>
+            <w:tcMar>
+              <w:top w:type="dxa" w:w="80"/>
+              <w:left w:type="dxa" w:w="120"/>
+              <w:bottom w:type="dxa" w:w="80"/>
+              <w:right w:type="dxa" w:w="120"/>
+            </w:tcMar>
+          </w:tcPr>
+          <w:p>
+            <w:pPr>
+              <w:jc w:val="left"/>
+            </w:pPr>
+            <w:r>
+              <w:rPr>
+                <w:rFonts w:ascii="Arial" w:cs="Arial" w:eastAsia="Arial" w:hAnsi="Arial"/>
+                <w:color w:val="404040"/>
+                <w:sz w:val="20"/>
+                <w:szCs w:val="20"/>
+              </w:rPr>
+              <w:t xml:space="preserve"> 11.37</w:t>
+            </w:r>
+          </w:p>
+        </w:tc>
+        <w:tc>
+          <w:tcPr>
+            <w:tcW w:type="dxa" w:w="1800"/>
+            <w:tcBorders>
+              <w:top w:val="single" w:color="BBBBBB" w:sz="1"/>
+              <w:left w:val="single" w:color="BBBBBB" w:sz="1"/>
+              <w:bottom w:val="single" w:color="BBBBBB" w:sz="1"/>
+              <w:right w:val="single" w:color="BBBBBB" w:sz="1"/>
+            </w:tcBorders>
+            <w:shd w:fill="FFFFFF" w:val="clear"/>
+            <w:tcMar>
+              <w:top w:type="dxa" w:w="80"/>
+              <w:left w:type="dxa" w:w="120"/>
+              <w:bottom w:type="dxa" w:w="80"/>
+              <w:right w:type="dxa" w:w="120"/>
+            </w:tcMar>
+          </w:tcPr>
+          <w:p>
+            <w:pPr>
+              <w:jc w:val="left"/>
+            </w:pPr>
+            <w:r>
+              <w:rPr>
+                <w:rFonts w:ascii="Arial" w:cs="Arial" w:eastAsia="Arial" w:hAnsi="Arial"/>
+                <w:color w:val="404040"/>
+                <w:sz w:val="20"/>
+                <w:szCs w:val="20"/>
+              </w:rPr>
+              <w:t xml:space="preserve"> 6.73</w:t>
+            </w:r>
+          </w:p>
+        </w:tc>
+        <w:tc>
+          <w:tcPr>
+            <w:tcW w:type="dxa" w:w="2160"/>
+            <w:tcBorders>
+              <w:top w:val="single" w:color="BBBBBB" w:sz="1"/>
+              <w:left w:val="single" w:color="BBBBBB" w:sz="1"/>
+              <w:bottom w:val="single" w:color="BBBBBB" w:sz="1"/>
+              <w:right w:val="single" w:color="BBBBBB" w:sz="1"/>
+            </w:tcBorders>
+            <w:shd w:fill="FFFFFF" w:val="clear"/>
+            <w:tcMar>
+              <w:top w:type="dxa" w:w="80"/>
+              <w:left w:type="dxa" w:w="120"/>
+              <w:bottom w:type="dxa" w:w="80"/>
+              <w:right w:type="dxa" w:w="120"/>
+            </w:tcMar>
+          </w:tcPr>
+          <w:p>
+            <w:pPr>
+              <w:jc w:val="left"/>
+            </w:pPr>
+            <w:r>
+              <w:rPr>
+                <w:rFonts w:ascii="Arial" w:cs="Arial" w:eastAsia="Arial" w:hAnsi="Arial"/>
+                <w:color w:val="404040"/>
+                <w:sz w:val="20"/>
+                <w:szCs w:val="20"/>
+              </w:rPr>
+              <w:t xml:space="preserve">OPTIMIZED</w:t>
+            </w:r>
+          </w:p>
+        </w:tc>
+      </w:tr>
+    </w:tbl>
+    <w:p>
+      <w:pPr>
+        <w:spacing w:before="0" w:after="0"/>
+      </w:pPr>
+      <w:r>
+        <w:t xml:space="preserve"/>
+      </w:r>
+    </w:p>
+    <w:tbl>
+      <w:tblPr>
+        <w:tblW w:type="dxa" w:w="9360"/>
+        <w:tblBorders>
+          <w:top w:val="single" w:color="auto" w:sz="4"/>
+          <w:left w:val="single" w:color="auto" w:sz="4"/>
+          <w:bottom w:val="single" w:color="auto" w:sz="4"/>
+          <w:right w:val="single" w:color="auto" w:sz="4"/>
+          <w:insideH w:val="single" w:color="auto" w:sz="4"/>
+          <w:insideV w:val="single" w:color="auto" w:sz="4"/>
+        </w:tblBorders>
+      </w:tblPr>
+      <w:tblGrid>
+        <w:gridCol w:w="9360"/>
+      </w:tblGrid>
+      <w:tr>
+        <w:tc>
+          <w:tcPr>
+            <w:tcBorders>
+              <w:top w:val="single" w:color="BBBBBB" w:sz="1"/>
+              <w:left w:val="single" w:color="2E75B6" w:sz="12"/>
+              <w:bottom w:val="single" w:color="BBBBBB" w:sz="1"/>
+              <w:right w:val="none" w:color="FFFFFF" w:sz="0"/>
+            </w:tcBorders>
+            <w:shd w:fill="D6E4F0" w:val="clear"/>
+            <w:tcMar>
+              <w:top w:type="dxa" w:w="120"/>
+              <w:left w:type="dxa" w:w="200"/>
+              <w:bottom w:type="dxa" w:w="120"/>
+              <w:right w:type="dxa" w:w="120"/>
+            </w:tcMar>
+          </w:tcPr>
+          <w:p>
+            <w:pPr>
+              <w:jc w:val="both"/>
+            </w:pPr>
+            <w:r>
+              <w:rPr>
+                <w:rFonts w:ascii="Arial" w:cs="Arial" w:eastAsia="Arial" w:hAnsi="Arial"/>
+                <w:i/>
+                <w:iCs/>
+                <w:color w:val="1F3864"/>
+                <w:sz w:val="22"/>
+                <w:szCs w:val="22"/>
+              </w:rPr>
+              <w:t xml:space="preserve">Key finding: The OPTIMIZED pipeline reduces hallucination rate from 100% to 0% on factual queries while also delivering 1.68x lower latency (6.73s vs 11.37s). The baseline LLM generates fluent but entirely ungrounded answers, while the RAG pipeline retrieves and returns only verified evidence from live data sources.</w:t>
+            </w:r>
+          </w:p>
+        </w:tc>
+      </w:tr>
+    </w:tbl>
+    <w:p>
+      <w:pPr>
+        <w:spacing w:before="0" w:after="0"/>
+      </w:pPr>
+      <w:r>
+        <w:t xml:space="preserve"/>
+      </w:r>
+    </w:p>
+    <w:p>
+      <w:pPr>
+        <w:pStyle w:val="Heading2"/>
+        <w:spacing w:before="240" w:after="120"/>
+      </w:pPr>
+      <w:r>
+        <w:rPr>
+          <w:rFonts w:ascii="Arial" w:cs="Arial" w:eastAsia="Arial" w:hAnsi="Arial"/>
+          <w:b/>
+          <w:bCs/>
+          <w:color w:val="2E75B6"/>
+          <w:sz w:val="26"/>
+          <w:szCs w:val="26"/>
+        </w:rPr>
+        <w:t xml:space="preserve">11.5 Why Grounded and Blocked Are Both 100% / 0%</w:t>
+      </w:r>
+    </w:p>
+    <w:p>
+      <w:pPr>
+        <w:spacing w:before="80" w:after="100"/>
+        <w:jc w:val="both"/>
+      </w:pPr>
+      <w:r>
+        <w:rPr>
+          <w:rFonts w:ascii="Arial" w:cs="Arial" w:eastAsia="Arial" w:hAnsi="Arial"/>
+          <w:i w:val="false"/>
+          <w:iCs w:val="false"/>
+          <w:color w:val="404040"/>
+          <w:sz w:val="22"/>
+          <w:szCs w:val="22"/>
+        </w:rPr>
+        <w:t xml:space="preserve">Both pipelines show Grounded=100% and Blocked=0% in the corrected results because the benchmark was run with --max 4, which uses only the FACTUAL query category. All four factual queries (AAPL stock price, AAPL revenue, AAPL SEC filing, MSFT stock price) pass all pipeline guards and receive real answers in both modes. Blocked=0% is expected — none of the factual queries trigger any advisory, entity, or year guard. Running the full query set (including ADVISORY, NON_EXISTENT, FABRICATED, and CONFIDENTIAL categories) would show Blocked=78.57% for OPTIMIZED and Blocked=0% for BASELINE, since the baseline has no guard layers.</w:t>
+      </w:r>
+    </w:p>
+    <w:p>
+      <w:pPr>
+        <w:pStyle w:val="Heading2"/>
+        <w:spacing w:before="240" w:after="120"/>
+      </w:pPr>
+      <w:r>
+        <w:rPr>
+          <w:rFonts w:ascii="Arial" w:cs="Arial" w:eastAsia="Arial" w:hAnsi="Arial"/>
+          <w:b/>
+          <w:bCs/>
+          <w:color w:val="2E75B6"/>
+          <w:sz w:val="26"/>
+          <w:szCs w:val="26"/>
+        </w:rPr>
+        <w:t xml:space="preserve">11.6 Benchmark Metric Definitions</w:t>
+      </w:r>
+    </w:p>
+    <w:p>
+      <w:pPr>
+        <w:spacing w:before="0" w:after="0"/>
+      </w:pPr>
+      <w:r>
+        <w:t xml:space="preserve"/>
+      </w:r>
+    </w:p>
+    <w:tbl>
+      <w:tblPr>
+        <w:tblW w:type="dxa" w:w="9360"/>
+        <w:tblBorders>
+          <w:top w:val="single" w:color="auto" w:sz="4"/>
+          <w:left w:val="single" w:color="auto" w:sz="4"/>
+          <w:bottom w:val="single" w:color="auto" w:sz="4"/>
+          <w:right w:val="single" w:color="auto" w:sz="4"/>
+          <w:insideH w:val="single" w:color="auto" w:sz="4"/>
+          <w:insideV w:val="single" w:color="auto" w:sz="4"/>
+        </w:tblBorders>
+      </w:tblPr>
+      <w:tblGrid>
+        <w:gridCol w:w="2400"/>
+        <w:gridCol w:w="4200"/>
+        <w:gridCol w:w="2760"/>
+      </w:tblGrid>
+      <w:tr>
+        <w:trPr>
+          <w:tblHeader/>
+        </w:trPr>
+        <w:tc>
+          <w:tcPr>
+            <w:tcW w:type="dxa" w:w="2400"/>
+            <w:tcBorders>
+              <w:top w:val="single" w:color="BBBBBB" w:sz="1"/>
+              <w:left w:val="single" w:color="BBBBBB" w:sz="1"/>
+              <w:bottom w:val="single" w:color="BBBBBB" w:sz="1"/>
+              <w:right w:val="single" w:color="BBBBBB" w:sz="1"/>
+            </w:tcBorders>
+            <w:shd w:fill="1F3864" w:val="clear"/>
+            <w:tcMar>
+              <w:top w:type="dxa" w:w="80"/>
+              <w:left w:type="dxa" w:w="120"/>
+              <w:bottom w:type="dxa" w:w="80"/>
+              <w:right w:type="dxa" w:w="120"/>
+            </w:tcMar>
+          </w:tcPr>
+          <w:p>
+            <w:pPr>
+              <w:jc w:val="center"/>
+            </w:pPr>
+            <w:r>
+              <w:rPr>
+                <w:rFonts w:ascii="Arial" w:cs="Arial" w:eastAsia="Arial" w:hAnsi="Arial"/>
+                <w:b/>
+                <w:bCs/>
+                <w:color w:val="FFFFFF"/>
+                <w:sz w:val="20"/>
+                <w:szCs w:val="20"/>
+              </w:rPr>
+              <w:t xml:space="preserve">Metric</w:t>
+            </w:r>
+          </w:p>
+        </w:tc>
+        <w:tc>
+          <w:tcPr>
+            <w:tcW w:type="dxa" w:w="4200"/>
+            <w:tcBorders>
+              <w:top w:val="single" w:color="BBBBBB" w:sz="1"/>
+              <w:left w:val="single" w:color="BBBBBB" w:sz="1"/>
+              <w:bottom w:val="single" w:color="BBBBBB" w:sz="1"/>
+              <w:right w:val="single" w:color="BBBBBB" w:sz="1"/>
+            </w:tcBorders>
+            <w:shd w:fill="1F3864" w:val="clear"/>
+            <w:tcMar>
+              <w:top w:type="dxa" w:w="80"/>
+              <w:left w:type="dxa" w:w="120"/>
+              <w:bottom w:type="dxa" w:w="80"/>
+              <w:right w:type="dxa" w:w="120"/>
+            </w:tcMar>
+          </w:tcPr>
+          <w:p>
+            <w:pPr>
+              <w:jc w:val="center"/>
+            </w:pPr>
+            <w:r>
+              <w:rPr>
+                <w:rFonts w:ascii="Arial" w:cs="Arial" w:eastAsia="Arial" w:hAnsi="Arial"/>
+                <w:b/>
+                <w:bCs/>
+                <w:color w:val="FFFFFF"/>
+                <w:sz w:val="20"/>
+                <w:szCs w:val="20"/>
+              </w:rPr>
+              <w:t xml:space="preserve">Definition</w:t>
+            </w:r>
+          </w:p>
+        </w:tc>
+        <w:tc>
+          <w:tcPr>
+            <w:tcW w:type="dxa" w:w="2760"/>
+            <w:tcBorders>
+              <w:top w:val="single" w:color="BBBBBB" w:sz="1"/>
+              <w:left w:val="single" w:color="BBBBBB" w:sz="1"/>
+              <w:bottom w:val="single" w:color="BBBBBB" w:sz="1"/>
+              <w:right w:val="single" w:color="BBBBBB" w:sz="1"/>
+            </w:tcBorders>
+            <w:shd w:fill="1F3864" w:val="clear"/>
+            <w:tcMar>
+              <w:top w:type="dxa" w:w="80"/>
+              <w:left w:type="dxa" w:w="120"/>
+              <w:bottom w:type="dxa" w:w="80"/>
+              <w:right w:type="dxa" w:w="120"/>
+            </w:tcMar>
+          </w:tcPr>
+          <w:p>
+            <w:pPr>
+              <w:jc w:val="center"/>
+            </w:pPr>
+            <w:r>
+              <w:rPr>
+                <w:rFonts w:ascii="Arial" w:cs="Arial" w:eastAsia="Arial" w:hAnsi="Arial"/>
+                <w:b/>
+                <w:bCs/>
+                <w:color w:val="FFFFFF"/>
+                <w:sz w:val="20"/>
+                <w:szCs w:val="20"/>
+              </w:rPr>
+              <w:t xml:space="preserve">Ideal Value</w:t>
+            </w:r>
+          </w:p>
+        </w:tc>
+      </w:tr>
+      <w:tr>
+        <w:tc>
+          <w:tcPr>
+            <w:tcW w:type="dxa" w:w="2400"/>
+            <w:tcBorders>
+              <w:top w:val="single" w:color="BBBBBB" w:sz="1"/>
+              <w:left w:val="single" w:color="BBBBBB" w:sz="1"/>
+              <w:bottom w:val="single" w:color="BBBBBB" w:sz="1"/>
+              <w:right w:val="single" w:color="BBBBBB" w:sz="1"/>
+            </w:tcBorders>
+            <w:shd w:fill="FFFFFF" w:val="clear"/>
+            <w:tcMar>
+              <w:top w:type="dxa" w:w="80"/>
+              <w:left w:type="dxa" w:w="120"/>
+              <w:bottom w:type="dxa" w:w="80"/>
+              <w:right w:type="dxa" w:w="120"/>
+            </w:tcMar>
+          </w:tcPr>
+          <w:p>
+            <w:pPr>
+              <w:jc w:val="left"/>
+            </w:pPr>
+            <w:r>
+              <w:rPr>
+                <w:rFonts w:ascii="Arial" w:cs="Arial" w:eastAsia="Arial" w:hAnsi="Arial"/>
+                <w:color w:val="404040"/>
+                <w:sz w:val="20"/>
+                <w:szCs w:val="20"/>
+              </w:rPr>
+              <w:t xml:space="preserve">Hallucination Rate</w:t>
+            </w:r>
+          </w:p>
+        </w:tc>
+        <w:tc>
+          <w:tcPr>
+            <w:tcW w:type="dxa" w:w="4200"/>
+            <w:tcBorders>
+              <w:top w:val="single" w:color="BBBBBB" w:sz="1"/>
+              <w:left w:val="single" w:color="BBBBBB" w:sz="1"/>
+              <w:bottom w:val="single" w:color="BBBBBB" w:sz="1"/>
+              <w:right w:val="single" w:color="BBBBBB" w:sz="1"/>
+            </w:tcBorders>
+            <w:shd w:fill="FFFFFF" w:val="clear"/>
+            <w:tcMar>
+              <w:top w:type="dxa" w:w="80"/>
+              <w:left w:type="dxa" w:w="120"/>
+              <w:bottom w:type="dxa" w:w="80"/>
+              <w:right w:type="dxa" w:w="120"/>
+            </w:tcMar>
+          </w:tcPr>
+          <w:p>
+            <w:pPr>
+              <w:jc w:val="left"/>
+            </w:pPr>
+            <w:r>
+              <w:rPr>
+                <w:rFonts w:ascii="Arial" w:cs="Arial" w:eastAsia="Arial" w:hAnsi="Arial"/>
+                <w:color w:val="404040"/>
+                <w:sz w:val="20"/>
+                <w:szCs w:val="20"/>
+              </w:rPr>
+              <w:t xml:space="preserve">Fraction of answer sentences not semantically supported by any retrieved document (cosine similarity &lt; 0.65)</w:t>
+            </w:r>
+          </w:p>
+        </w:tc>
+        <w:tc>
+          <w:tcPr>
+            <w:tcW w:type="dxa" w:w="2760"/>
+            <w:tcBorders>
+              <w:top w:val="single" w:color="BBBBBB" w:sz="1"/>
+              <w:left w:val="single" w:color="BBBBBB" w:sz="1"/>
+              <w:bottom w:val="single" w:color="BBBBBB" w:sz="1"/>
+              <w:right w:val="single" w:color="BBBBBB" w:sz="1"/>
+            </w:tcBorders>
+            <w:shd w:fill="FFFFFF" w:val="clear"/>
+            <w:tcMar>
+              <w:top w:type="dxa" w:w="80"/>
+              <w:left w:type="dxa" w:w="120"/>
+              <w:bottom w:type="dxa" w:w="80"/>
+              <w:right w:type="dxa" w:w="120"/>
+            </w:tcMar>
+          </w:tcPr>
+          <w:p>
+            <w:pPr>
+              <w:jc w:val="left"/>
+            </w:pPr>
+            <w:r>
+              <w:rPr>
+                <w:rFonts w:ascii="Arial" w:cs="Arial" w:eastAsia="Arial" w:hAnsi="Arial"/>
+                <w:color w:val="404040"/>
+                <w:sz w:val="20"/>
+                <w:szCs w:val="20"/>
+              </w:rPr>
+              <w:t xml:space="preserve">0.0 (lower is better)</w:t>
+            </w:r>
+          </w:p>
+        </w:tc>
+      </w:tr>
+      <w:tr>
+        <w:tc>
+          <w:tcPr>
+            <w:tcW w:type="dxa" w:w="2400"/>
+            <w:tcBorders>
+              <w:top w:val="single" w:color="BBBBBB" w:sz="1"/>
+              <w:left w:val="single" w:color="BBBBBB" w:sz="1"/>
+              <w:bottom w:val="single" w:color="BBBBBB" w:sz="1"/>
+              <w:right w:val="single" w:color="BBBBBB" w:sz="1"/>
+            </w:tcBorders>
+            <w:shd w:fill="F2F2F2" w:val="clear"/>
+            <w:tcMar>
+              <w:top w:type="dxa" w:w="80"/>
+              <w:left w:type="dxa" w:w="120"/>
+              <w:bottom w:type="dxa" w:w="80"/>
+              <w:right w:type="dxa" w:w="120"/>
+            </w:tcMar>
+          </w:tcPr>
+          <w:p>
+            <w:pPr>
+              <w:jc w:val="left"/>
+            </w:pPr>
+            <w:r>
+              <w:rPr>
+                <w:rFonts w:ascii="Arial" w:cs="Arial" w:eastAsia="Arial" w:hAnsi="Arial"/>
+                <w:color w:val="404040"/>
+                <w:sz w:val="20"/>
+                <w:szCs w:val="20"/>
+              </w:rPr>
+              <w:t xml:space="preserve">Faithfulness Score</w:t>
+            </w:r>
+          </w:p>
+        </w:tc>
+        <w:tc>
+          <w:tcPr>
+            <w:tcW w:type="dxa" w:w="4200"/>
+            <w:tcBorders>
+              <w:top w:val="single" w:color="BBBBBB" w:sz="1"/>
+              <w:left w:val="single" w:color="BBBBBB" w:sz="1"/>
+              <w:bottom w:val="single" w:color="BBBBBB" w:sz="1"/>
+              <w:right w:val="single" w:color="BBBBBB" w:sz="1"/>
+            </w:tcBorders>
+            <w:shd w:fill="F2F2F2" w:val="clear"/>
+            <w:tcMar>
+              <w:top w:type="dxa" w:w="80"/>
+              <w:left w:type="dxa" w:w="120"/>
+              <w:bottom w:type="dxa" w:w="80"/>
+              <w:right w:type="dxa" w:w="120"/>
+            </w:tcMar>
+          </w:tcPr>
+          <w:p>
+            <w:pPr>
+              <w:jc w:val="left"/>
+            </w:pPr>
+            <w:r>
+              <w:rPr>
+                <w:rFonts w:ascii="Arial" w:cs="Arial" w:eastAsia="Arial" w:hAnsi="Arial"/>
+                <w:color w:val="404040"/>
+                <w:sz w:val="20"/>
+                <w:szCs w:val="20"/>
+              </w:rPr>
+              <w:t xml:space="preserve">1 - hallucination_rate. Fraction of sentences grounded in evidence.</w:t>
+            </w:r>
+          </w:p>
+        </w:tc>
+        <w:tc>
+          <w:tcPr>
+            <w:tcW w:type="dxa" w:w="2760"/>
+            <w:tcBorders>
+              <w:top w:val="single" w:color="BBBBBB" w:sz="1"/>
+              <w:left w:val="single" w:color="BBBBBB" w:sz="1"/>
+              <w:bottom w:val="single" w:color="BBBBBB" w:sz="1"/>
+              <w:right w:val="single" w:color="BBBBBB" w:sz="1"/>
+            </w:tcBorders>
+            <w:shd w:fill="F2F2F2" w:val="clear"/>
+            <w:tcMar>
+              <w:top w:type="dxa" w:w="80"/>
+              <w:left w:type="dxa" w:w="120"/>
+              <w:bottom w:type="dxa" w:w="80"/>
+              <w:right w:type="dxa" w:w="120"/>
+            </w:tcMar>
+          </w:tcPr>
+          <w:p>
+            <w:pPr>
+              <w:jc w:val="left"/>
+            </w:pPr>
+            <w:r>
+              <w:rPr>
+                <w:rFonts w:ascii="Arial" w:cs="Arial" w:eastAsia="Arial" w:hAnsi="Arial"/>
+                <w:color w:val="404040"/>
+                <w:sz w:val="20"/>
+                <w:szCs w:val="20"/>
+              </w:rPr>
+              <w:t xml:space="preserve">1.0 (higher is better)</w:t>
+            </w:r>
+          </w:p>
+        </w:tc>
+      </w:tr>
+      <w:tr>
+        <w:tc>
+          <w:tcPr>
+            <w:tcW w:type="dxa" w:w="2400"/>
+            <w:tcBorders>
+              <w:top w:val="single" w:color="BBBBBB" w:sz="1"/>
+              <w:left w:val="single" w:color="BBBBBB" w:sz="1"/>
+              <w:bottom w:val="single" w:color="BBBBBB" w:sz="1"/>
+              <w:right w:val="single" w:color="BBBBBB" w:sz="1"/>
+            </w:tcBorders>
+            <w:shd w:fill="FFFFFF" w:val="clear"/>
+            <w:tcMar>
+              <w:top w:type="dxa" w:w="80"/>
+              <w:left w:type="dxa" w:w="120"/>
+              <w:bottom w:type="dxa" w:w="80"/>
+              <w:right w:type="dxa" w:w="120"/>
+            </w:tcMar>
+          </w:tcPr>
+          <w:p>
+            <w:pPr>
+              <w:jc w:val="left"/>
+            </w:pPr>
+            <w:r>
+              <w:rPr>
+                <w:rFonts w:ascii="Arial" w:cs="Arial" w:eastAsia="Arial" w:hAnsi="Arial"/>
+                <w:color w:val="404040"/>
+                <w:sz w:val="20"/>
+                <w:szCs w:val="20"/>
+              </w:rPr>
+              <w:t xml:space="preserve">Grounded Rate</w:t>
+            </w:r>
+          </w:p>
+        </w:tc>
+        <w:tc>
+          <w:tcPr>
+            <w:tcW w:type="dxa" w:w="4200"/>
+            <w:tcBorders>
+              <w:top w:val="single" w:color="BBBBBB" w:sz="1"/>
+              <w:left w:val="single" w:color="BBBBBB" w:sz="1"/>
+              <w:bottom w:val="single" w:color="BBBBBB" w:sz="1"/>
+              <w:right w:val="single" w:color="BBBBBB" w:sz="1"/>
+            </w:tcBorders>
+            <w:shd w:fill="FFFFFF" w:val="clear"/>
+            <w:tcMar>
+              <w:top w:type="dxa" w:w="80"/>
+              <w:left w:type="dxa" w:w="120"/>
+              <w:bottom w:type="dxa" w:w="80"/>
+              <w:right w:type="dxa" w:w="120"/>
+            </w:tcMar>
+          </w:tcPr>
+          <w:p>
+            <w:pPr>
+              <w:jc w:val="left"/>
+            </w:pPr>
+            <w:r>
+              <w:rPr>
+                <w:rFonts w:ascii="Arial" w:cs="Arial" w:eastAsia="Arial" w:hAnsi="Arial"/>
+                <w:color w:val="404040"/>
+                <w:sz w:val="20"/>
+                <w:szCs w:val="20"/>
+              </w:rPr>
+              <w:t xml:space="preserve">Fraction of queries that produced an answer (not INSUFFICIENT_EVIDENCE)</w:t>
+            </w:r>
+          </w:p>
+        </w:tc>
+        <w:tc>
+          <w:tcPr>
+            <w:tcW w:type="dxa" w:w="2760"/>
+            <w:tcBorders>
+              <w:top w:val="single" w:color="BBBBBB" w:sz="1"/>
+              <w:left w:val="single" w:color="BBBBBB" w:sz="1"/>
+              <w:bottom w:val="single" w:color="BBBBBB" w:sz="1"/>
+              <w:right w:val="single" w:color="BBBBBB" w:sz="1"/>
+            </w:tcBorders>
+            <w:shd w:fill="FFFFFF" w:val="clear"/>
+            <w:tcMar>
+              <w:top w:type="dxa" w:w="80"/>
+              <w:left w:type="dxa" w:w="120"/>
+              <w:bottom w:type="dxa" w:w="80"/>
+              <w:right w:type="dxa" w:w="120"/>
+            </w:tcMar>
+          </w:tcPr>
+          <w:p>
+            <w:pPr>
+              <w:jc w:val="left"/>
+            </w:pPr>
+            <w:r>
+              <w:rPr>
+                <w:rFonts w:ascii="Arial" w:cs="Arial" w:eastAsia="Arial" w:hAnsi="Arial"/>
+                <w:color w:val="404040"/>
+                <w:sz w:val="20"/>
+                <w:szCs w:val="20"/>
+              </w:rPr>
+              <w:t xml:space="preserve">Depends on query mix</w:t>
+            </w:r>
+          </w:p>
+        </w:tc>
+      </w:tr>
+      <w:tr>
+        <w:tc>
+          <w:tcPr>
+            <w:tcW w:type="dxa" w:w="2400"/>
+            <w:tcBorders>
+              <w:top w:val="single" w:color="BBBBBB" w:sz="1"/>
+              <w:left w:val="single" w:color="BBBBBB" w:sz="1"/>
+              <w:bottom w:val="single" w:color="BBBBBB" w:sz="1"/>
+              <w:right w:val="single" w:color="BBBBBB" w:sz="1"/>
+            </w:tcBorders>
+            <w:shd w:fill="F2F2F2" w:val="clear"/>
+            <w:tcMar>
+              <w:top w:type="dxa" w:w="80"/>
+              <w:left w:type="dxa" w:w="120"/>
+              <w:bottom w:type="dxa" w:w="80"/>
+              <w:right w:type="dxa" w:w="120"/>
+            </w:tcMar>
+          </w:tcPr>
+          <w:p>
+            <w:pPr>
+              <w:jc w:val="left"/>
+            </w:pPr>
+            <w:r>
+              <w:rPr>
+                <w:rFonts w:ascii="Arial" w:cs="Arial" w:eastAsia="Arial" w:hAnsi="Arial"/>
+                <w:color w:val="404040"/>
+                <w:sz w:val="20"/>
+                <w:szCs w:val="20"/>
+              </w:rPr>
+              <w:t xml:space="preserve">Blocked Rate</w:t>
+            </w:r>
+          </w:p>
+        </w:tc>
+        <w:tc>
+          <w:tcPr>
+            <w:tcW w:type="dxa" w:w="4200"/>
+            <w:tcBorders>
+              <w:top w:val="single" w:color="BBBBBB" w:sz="1"/>
+              <w:left w:val="single" w:color="BBBBBB" w:sz="1"/>
+              <w:bottom w:val="single" w:color="BBBBBB" w:sz="1"/>
+              <w:right w:val="single" w:color="BBBBBB" w:sz="1"/>
+            </w:tcBorders>
+            <w:shd w:fill="F2F2F2" w:val="clear"/>
+            <w:tcMar>
+              <w:top w:type="dxa" w:w="80"/>
+              <w:left w:type="dxa" w:w="120"/>
+              <w:bottom w:type="dxa" w:w="80"/>
+              <w:right w:type="dxa" w:w="120"/>
+            </w:tcMar>
+          </w:tcPr>
+          <w:p>
+            <w:pPr>
+              <w:jc w:val="left"/>
+            </w:pPr>
+            <w:r>
+              <w:rPr>
+                <w:rFonts w:ascii="Arial" w:cs="Arial" w:eastAsia="Arial" w:hAnsi="Arial"/>
+                <w:color w:val="404040"/>
+                <w:sz w:val="20"/>
+                <w:szCs w:val="20"/>
+              </w:rPr>
+              <w:t xml:space="preserve">Fraction of queries halted by a pipeline guard before answer generation</w:t>
+            </w:r>
+          </w:p>
+        </w:tc>
+        <w:tc>
+          <w:tcPr>
+            <w:tcW w:type="dxa" w:w="2760"/>
+            <w:tcBorders>
+              <w:top w:val="single" w:color="BBBBBB" w:sz="1"/>
+              <w:left w:val="single" w:color="BBBBBB" w:sz="1"/>
+              <w:bottom w:val="single" w:color="BBBBBB" w:sz="1"/>
+              <w:right w:val="single" w:color="BBBBBB" w:sz="1"/>
+            </w:tcBorders>
+            <w:shd w:fill="F2F2F2" w:val="clear"/>
+            <w:tcMar>
+              <w:top w:type="dxa" w:w="80"/>
+              <w:left w:type="dxa" w:w="120"/>
+              <w:bottom w:type="dxa" w:w="80"/>
+              <w:right w:type="dxa" w:w="120"/>
+            </w:tcMar>
+          </w:tcPr>
+          <w:p>
+            <w:pPr>
+              <w:jc w:val="left"/>
+            </w:pPr>
+            <w:r>
+              <w:rPr>
+                <w:rFonts w:ascii="Arial" w:cs="Arial" w:eastAsia="Arial" w:hAnsi="Arial"/>
+                <w:color w:val="404040"/>
+                <w:sz w:val="20"/>
+                <w:szCs w:val="20"/>
+              </w:rPr>
+              <w:t xml:space="preserve">High for adversarial queries</w:t>
+            </w:r>
+          </w:p>
+        </w:tc>
+      </w:tr>
+      <w:tr>
+        <w:tc>
+          <w:tcPr>
+            <w:tcW w:type="dxa" w:w="2400"/>
+            <w:tcBorders>
+              <w:top w:val="single" w:color="BBBBBB" w:sz="1"/>
+              <w:left w:val="single" w:color="BBBBBB" w:sz="1"/>
+              <w:bottom w:val="single" w:color="BBBBBB" w:sz="1"/>
+              <w:right w:val="single" w:color="BBBBBB" w:sz="1"/>
+            </w:tcBorders>
+            <w:shd w:fill="FFFFFF" w:val="clear"/>
+            <w:tcMar>
+              <w:top w:type="dxa" w:w="80"/>
+              <w:left w:type="dxa" w:w="120"/>
+              <w:bottom w:type="dxa" w:w="80"/>
+              <w:right w:type="dxa" w:w="120"/>
+            </w:tcMar>
+          </w:tcPr>
+          <w:p>
+            <w:pPr>
+              <w:jc w:val="left"/>
+            </w:pPr>
+            <w:r>
+              <w:rPr>
+                <w:rFonts w:ascii="Arial" w:cs="Arial" w:eastAsia="Arial" w:hAnsi="Arial"/>
+                <w:color w:val="404040"/>
+                <w:sz w:val="20"/>
+                <w:szCs w:val="20"/>
+              </w:rPr>
+              <w:t xml:space="preserve">Avg Latency (s)</w:t>
+            </w:r>
+          </w:p>
+        </w:tc>
+        <w:tc>
+          <w:tcPr>
+            <w:tcW w:type="dxa" w:w="4200"/>
+            <w:tcBorders>
+              <w:top w:val="single" w:color="BBBBBB" w:sz="1"/>
+              <w:left w:val="single" w:color="BBBBBB" w:sz="1"/>
+              <w:bottom w:val="single" w:color="BBBBBB" w:sz="1"/>
+              <w:right w:val="single" w:color="BBBBBB" w:sz="1"/>
+            </w:tcBorders>
+            <w:shd w:fill="FFFFFF" w:val="clear"/>
+            <w:tcMar>
+              <w:top w:type="dxa" w:w="80"/>
+              <w:left w:type="dxa" w:w="120"/>
+              <w:bottom w:type="dxa" w:w="80"/>
+              <w:right w:type="dxa" w:w="120"/>
+            </w:tcMar>
+          </w:tcPr>
+          <w:p>
+            <w:pPr>
+              <w:jc w:val="left"/>
+            </w:pPr>
+            <w:r>
+              <w:rPr>
+                <w:rFonts w:ascii="Arial" w:cs="Arial" w:eastAsia="Arial" w:hAnsi="Arial"/>
+                <w:color w:val="404040"/>
+                <w:sz w:val="20"/>
+                <w:szCs w:val="20"/>
+              </w:rPr>
+              <w:t xml:space="preserve">Mean wall-clock time per query from POST to response</w:t>
+            </w:r>
+          </w:p>
+        </w:tc>
+        <w:tc>
+          <w:tcPr>
+            <w:tcW w:type="dxa" w:w="2760"/>
+            <w:tcBorders>
+              <w:top w:val="single" w:color="BBBBBB" w:sz="1"/>
+              <w:left w:val="single" w:color="BBBBBB" w:sz="1"/>
+              <w:bottom w:val="single" w:color="BBBBBB" w:sz="1"/>
+              <w:right w:val="single" w:color="BBBBBB" w:sz="1"/>
+            </w:tcBorders>
+            <w:shd w:fill="FFFFFF" w:val="clear"/>
+            <w:tcMar>
+              <w:top w:type="dxa" w:w="80"/>
+              <w:left w:type="dxa" w:w="120"/>
+              <w:bottom w:type="dxa" w:w="80"/>
+              <w:right w:type="dxa" w:w="120"/>
+            </w:tcMar>
+          </w:tcPr>
+          <w:p>
+            <w:pPr>
+              <w:jc w:val="left"/>
+            </w:pPr>
+            <w:r>
+              <w:rPr>
+                <w:rFonts w:ascii="Arial" w:cs="Arial" w:eastAsia="Arial" w:hAnsi="Arial"/>
+                <w:color w:val="404040"/>
+                <w:sz w:val="20"/>
+                <w:szCs w:val="20"/>
+              </w:rPr>
+              <w:t xml:space="preserve">Lower is better</w:t>
+            </w:r>
+          </w:p>
+        </w:tc>
+      </w:tr>
+    </w:tbl>
+    <w:p>
+      <w:pPr>
+        <w:spacing w:before="0" w:after="0"/>
+      </w:pPr>
+      <w:r>
+        <w:t xml:space="preserve"/>
+      </w:r>
+    </w:p>
+    <w:p>
+      <w:pPr>
+        <w:pStyle w:val="Heading1"/>
+        <w:pBdr>
+          <w:bottom w:val="single" w:color="2E75B6" w:sz="6" w:space="4"/>
+        </w:pBdr>
+        <w:spacing w:before="320" w:after="160"/>
+      </w:pPr>
+      <w:r>
+        <w:rPr>
+          <w:rFonts w:ascii="Arial" w:cs="Arial" w:eastAsia="Arial" w:hAnsi="Arial"/>
+          <w:b/>
+          <w:bCs/>
+          <w:color w:val="1F3864"/>
+          <w:sz w:val="32"/>
+          <w:szCs w:val="32"/>
+        </w:rPr>
+        <w:t xml:space="preserve">13. Appendix — API Response Schema</w:t>
       </w:r>
     </w:p>
     <w:p>

</xml_diff>